<commit_message>
Added first draft of Project Title, Introduction & Motivation, and Problem Statement to the report.
</commit_message>
<xml_diff>
--- a/Report.docx
+++ b/Report.docx
@@ -8,6 +8,7 @@
         <w:ind w:left="-5"/>
         <w:jc w:val="center"/>
         <w:rPr>
+          <w:rFonts w:ascii="Arial" w:hAnsi="Arial" w:cs="Arial"/>
           <w:b/>
           <w:sz w:val="28"/>
           <w:szCs w:val="28"/>
@@ -16,6 +17,7 @@
       </w:pPr>
       <w:r>
         <w:rPr>
+          <w:rFonts w:ascii="Arial" w:hAnsi="Arial" w:cs="Arial"/>
           <w:b/>
           <w:sz w:val="28"/>
           <w:szCs w:val="28"/>
@@ -25,6 +27,7 @@
       </w:r>
       <w:r>
         <w:rPr>
+          <w:rFonts w:ascii="Arial" w:hAnsi="Arial" w:cs="Arial"/>
           <w:b/>
           <w:sz w:val="28"/>
           <w:szCs w:val="28"/>
@@ -34,6 +37,7 @@
       </w:r>
       <w:r>
         <w:rPr>
+          <w:rFonts w:ascii="Arial" w:hAnsi="Arial" w:cs="Arial"/>
           <w:b/>
           <w:sz w:val="28"/>
           <w:szCs w:val="28"/>
@@ -48,6 +52,7 @@
         <w:ind w:left="-5"/>
         <w:jc w:val="center"/>
         <w:rPr>
+          <w:rFonts w:ascii="Arial" w:hAnsi="Arial" w:cs="Arial"/>
           <w:b/>
           <w:sz w:val="28"/>
           <w:szCs w:val="28"/>
@@ -56,6 +61,7 @@
       </w:pPr>
       <w:r>
         <w:rPr>
+          <w:rFonts w:ascii="Arial" w:hAnsi="Arial" w:cs="Arial"/>
           <w:b/>
           <w:sz w:val="28"/>
           <w:szCs w:val="28"/>
@@ -65,6 +71,7 @@
       </w:r>
       <w:r>
         <w:rPr>
+          <w:rFonts w:ascii="Arial" w:hAnsi="Arial" w:cs="Arial"/>
           <w:b/>
           <w:sz w:val="28"/>
           <w:szCs w:val="28"/>
@@ -74,6 +81,7 @@
       </w:r>
       <w:r>
         <w:rPr>
+          <w:rFonts w:ascii="Arial" w:hAnsi="Arial" w:cs="Arial"/>
           <w:b/>
           <w:sz w:val="28"/>
           <w:szCs w:val="28"/>
@@ -83,6 +91,7 @@
       </w:r>
       <w:r>
         <w:rPr>
+          <w:rFonts w:ascii="Arial" w:hAnsi="Arial" w:cs="Arial"/>
           <w:b/>
           <w:sz w:val="28"/>
           <w:szCs w:val="28"/>
@@ -92,6 +101,7 @@
       </w:r>
       <w:r>
         <w:rPr>
+          <w:rFonts w:ascii="Arial" w:hAnsi="Arial" w:cs="Arial"/>
           <w:b/>
           <w:sz w:val="28"/>
           <w:szCs w:val="28"/>
@@ -106,9 +116,8 @@
         <w:ind w:left="-5"/>
         <w:jc w:val="center"/>
         <w:rPr>
-          <w:b/>
-          <w:sz w:val="28"/>
-          <w:szCs w:val="28"/>
+          <w:rFonts w:ascii="Arial" w:hAnsi="Arial" w:cs="Arial"/>
+          <w:b/>
           <w:u w:val="single" w:color="000000"/>
         </w:rPr>
       </w:pPr>
@@ -117,7 +126,7 @@
       <w:tblPr>
         <w:tblStyle w:val="TableGrid"/>
         <w:tblW w:w="0" w:type="auto"/>
-        <w:tblInd w:w="-6" w:type="dxa"/>
+        <w:jc w:val="center"/>
         <w:tblBorders>
           <w:top w:val="none" w:sz="0" w:space="0" w:color="auto"/>
           <w:left w:val="none" w:sz="0" w:space="0" w:color="auto"/>
@@ -129,14 +138,17 @@
         <w:tblLook w:val="04A0" w:firstRow="1" w:lastRow="0" w:firstColumn="1" w:lastColumn="0" w:noHBand="0" w:noVBand="1"/>
       </w:tblPr>
       <w:tblGrid>
-        <w:gridCol w:w="3005"/>
-        <w:gridCol w:w="3005"/>
-        <w:gridCol w:w="3006"/>
+        <w:gridCol w:w="2835"/>
+        <w:gridCol w:w="2694"/>
+        <w:gridCol w:w="3487"/>
       </w:tblGrid>
       <w:tr>
+        <w:trPr>
+          <w:jc w:val="center"/>
+        </w:trPr>
         <w:tc>
           <w:tcPr>
-            <w:tcW w:w="3005" w:type="dxa"/>
+            <w:tcW w:w="2835" w:type="dxa"/>
           </w:tcPr>
           <w:p>
             <w:pPr>
@@ -144,6 +156,8 @@
               <w:ind w:left="0" w:firstLine="0"/>
               <w:rPr>
                 <w:rFonts w:ascii="Arial" w:hAnsi="Arial" w:cs="Arial"/>
+                <w:sz w:val="24"/>
+                <w:szCs w:val="24"/>
               </w:rPr>
             </w:pPr>
             <w:r>
@@ -151,6 +165,8 @@
                 <w:rFonts w:ascii="Arial" w:hAnsi="Arial" w:cs="Arial"/>
                 <w:b/>
                 <w:bCs/>
+                <w:sz w:val="24"/>
+                <w:szCs w:val="24"/>
               </w:rPr>
               <w:t>Student ID:</w:t>
             </w:r>
@@ -159,12 +175,16 @@
                 <w:rFonts w:ascii="Arial" w:hAnsi="Arial" w:cs="Arial"/>
                 <w:b/>
                 <w:bCs/>
+                <w:sz w:val="24"/>
+                <w:szCs w:val="24"/>
               </w:rPr>
               <w:t xml:space="preserve"> </w:t>
             </w:r>
             <w:r>
               <w:rPr>
                 <w:rFonts w:ascii="Arial" w:hAnsi="Arial" w:cs="Arial"/>
+                <w:sz w:val="24"/>
+                <w:szCs w:val="24"/>
               </w:rPr>
               <w:t>23636116</w:t>
             </w:r>
@@ -172,7 +192,7 @@
         </w:tc>
         <w:tc>
           <w:tcPr>
-            <w:tcW w:w="3005" w:type="dxa"/>
+            <w:tcW w:w="2694" w:type="dxa"/>
           </w:tcPr>
           <w:p>
             <w:pPr>
@@ -180,6 +200,8 @@
               <w:ind w:left="0" w:firstLine="0"/>
               <w:rPr>
                 <w:rFonts w:ascii="Arial" w:hAnsi="Arial" w:cs="Arial"/>
+                <w:sz w:val="24"/>
+                <w:szCs w:val="24"/>
               </w:rPr>
             </w:pPr>
             <w:r>
@@ -187,12 +209,16 @@
                 <w:rFonts w:ascii="Arial" w:hAnsi="Arial" w:cs="Arial"/>
                 <w:b/>
                 <w:bCs/>
+                <w:sz w:val="24"/>
+                <w:szCs w:val="24"/>
               </w:rPr>
               <w:t xml:space="preserve">Surname: </w:t>
             </w:r>
             <w:r>
               <w:rPr>
                 <w:rFonts w:ascii="Arial" w:hAnsi="Arial" w:cs="Arial"/>
+                <w:sz w:val="24"/>
+                <w:szCs w:val="24"/>
               </w:rPr>
               <w:t>Carpenter</w:t>
             </w:r>
@@ -200,7 +226,7 @@
         </w:tc>
         <w:tc>
           <w:tcPr>
-            <w:tcW w:w="3006" w:type="dxa"/>
+            <w:tcW w:w="3487" w:type="dxa"/>
           </w:tcPr>
           <w:p>
             <w:pPr>
@@ -208,6 +234,8 @@
               <w:ind w:left="0" w:firstLine="0"/>
               <w:rPr>
                 <w:rFonts w:ascii="Arial" w:hAnsi="Arial" w:cs="Arial"/>
+                <w:sz w:val="24"/>
+                <w:szCs w:val="24"/>
               </w:rPr>
             </w:pPr>
             <w:r>
@@ -215,12 +243,16 @@
                 <w:rFonts w:ascii="Arial" w:hAnsi="Arial" w:cs="Arial"/>
                 <w:b/>
                 <w:bCs/>
+                <w:sz w:val="24"/>
+                <w:szCs w:val="24"/>
               </w:rPr>
               <w:t xml:space="preserve">First Name: </w:t>
             </w:r>
             <w:r>
               <w:rPr>
                 <w:rFonts w:ascii="Arial" w:hAnsi="Arial" w:cs="Arial"/>
+                <w:sz w:val="24"/>
+                <w:szCs w:val="24"/>
               </w:rPr>
               <w:t>Thomas (Tom)</w:t>
             </w:r>
@@ -235,6 +267,8 @@
         <w:rPr>
           <w:rFonts w:ascii="Arial" w:hAnsi="Arial" w:cs="Arial"/>
           <w:bCs/>
+          <w:sz w:val="24"/>
+          <w:szCs w:val="24"/>
         </w:rPr>
       </w:pPr>
     </w:p>
@@ -242,42 +276,82 @@
       <w:pPr>
         <w:spacing w:after="0" w:line="480" w:lineRule="auto"/>
         <w:ind w:left="-6" w:hanging="11"/>
-        <w:rPr>
-          <w:rFonts w:ascii="Arial" w:hAnsi="Arial" w:cs="Arial"/>
-          <w:b/>
-        </w:rPr>
-      </w:pPr>
-      <w:r>
-        <w:rPr>
-          <w:rFonts w:ascii="Arial" w:hAnsi="Arial" w:cs="Arial"/>
-          <w:b/>
-        </w:rPr>
-        <w:t>Title of the project:</w:t>
+        <w:jc w:val="both"/>
+        <w:rPr>
+          <w:rFonts w:ascii="Arial" w:hAnsi="Arial" w:cs="Arial"/>
+          <w:bCs/>
+          <w:sz w:val="24"/>
+          <w:szCs w:val="24"/>
+        </w:rPr>
+      </w:pPr>
+      <w:r>
+        <w:rPr>
+          <w:rFonts w:ascii="Arial" w:hAnsi="Arial" w:cs="Arial"/>
+          <w:b/>
+          <w:sz w:val="24"/>
+          <w:szCs w:val="24"/>
+        </w:rPr>
+        <w:t>Project Title</w:t>
+      </w:r>
+      <w:r>
+        <w:rPr>
+          <w:rFonts w:ascii="Arial" w:hAnsi="Arial" w:cs="Arial"/>
+          <w:b/>
+          <w:sz w:val="24"/>
+          <w:szCs w:val="24"/>
+        </w:rPr>
+        <w:t>:</w:t>
+      </w:r>
+      <w:r>
+        <w:rPr>
+          <w:rFonts w:ascii="Arial" w:hAnsi="Arial" w:cs="Arial"/>
+          <w:b/>
+          <w:sz w:val="24"/>
+          <w:szCs w:val="24"/>
+        </w:rPr>
+        <w:t xml:space="preserve"> </w:t>
+      </w:r>
+      <w:r>
+        <w:rPr>
+          <w:rFonts w:ascii="Arial" w:hAnsi="Arial" w:cs="Arial"/>
+          <w:bCs/>
+          <w:sz w:val="24"/>
+          <w:szCs w:val="24"/>
+        </w:rPr>
+        <w:t>North Coast Charity Events Consolidated Website</w:t>
       </w:r>
     </w:p>
     <w:p>
       <w:pPr>
         <w:spacing w:after="0" w:line="480" w:lineRule="auto"/>
         <w:ind w:left="-6" w:hanging="11"/>
+        <w:jc w:val="both"/>
         <w:rPr>
           <w:rFonts w:ascii="Arial" w:hAnsi="Arial" w:cs="Arial"/>
           <w:bCs/>
+          <w:sz w:val="24"/>
+          <w:szCs w:val="24"/>
         </w:rPr>
       </w:pPr>
     </w:p>
     <w:p>
       <w:pPr>
         <w:spacing w:after="0" w:line="480" w:lineRule="auto"/>
-        <w:ind w:left="-6" w:hanging="11"/>
-        <w:rPr>
-          <w:rFonts w:ascii="Arial" w:hAnsi="Arial" w:cs="Arial"/>
-          <w:b/>
-        </w:rPr>
-      </w:pPr>
-      <w:r>
-        <w:rPr>
-          <w:rFonts w:ascii="Arial" w:hAnsi="Arial" w:cs="Arial"/>
-          <w:b/>
+        <w:ind w:left="0" w:firstLine="0"/>
+        <w:jc w:val="both"/>
+        <w:rPr>
+          <w:rFonts w:ascii="Arial" w:hAnsi="Arial" w:cs="Arial"/>
+          <w:b/>
+          <w:sz w:val="24"/>
+          <w:szCs w:val="24"/>
+        </w:rPr>
+      </w:pPr>
+      <w:r>
+        <w:rPr>
+          <w:rFonts w:ascii="Arial" w:hAnsi="Arial" w:cs="Arial"/>
+          <w:b/>
+          <w:sz w:val="24"/>
+          <w:szCs w:val="24"/>
         </w:rPr>
         <w:t>Introduction</w:t>
       </w:r>
@@ -285,338 +359,333 @@
         <w:rPr>
           <w:rFonts w:ascii="Arial" w:hAnsi="Arial" w:cs="Arial"/>
           <w:b/>
-        </w:rPr>
-        <w:t>/Motivation</w:t>
+          <w:sz w:val="24"/>
+          <w:szCs w:val="24"/>
+        </w:rPr>
+        <w:t xml:space="preserve"> and </w:t>
+      </w:r>
+      <w:r>
+        <w:rPr>
+          <w:rFonts w:ascii="Arial" w:hAnsi="Arial" w:cs="Arial"/>
+          <w:b/>
+          <w:sz w:val="24"/>
+          <w:szCs w:val="24"/>
+        </w:rPr>
+        <w:t>Motivation</w:t>
+      </w:r>
+      <w:r>
+        <w:rPr>
+          <w:rFonts w:ascii="Arial" w:hAnsi="Arial" w:cs="Arial"/>
+          <w:b/>
+          <w:sz w:val="24"/>
+          <w:szCs w:val="24"/>
+        </w:rPr>
+        <w:t>:</w:t>
       </w:r>
     </w:p>
     <w:p>
       <w:pPr>
         <w:spacing w:after="0" w:line="480" w:lineRule="auto"/>
         <w:ind w:left="-6" w:hanging="11"/>
+        <w:jc w:val="both"/>
         <w:rPr>
           <w:rFonts w:ascii="Arial" w:hAnsi="Arial" w:cs="Arial"/>
           <w:bCs/>
-        </w:rPr>
-      </w:pPr>
+          <w:sz w:val="24"/>
+          <w:szCs w:val="24"/>
+        </w:rPr>
+      </w:pPr>
+      <w:r>
+        <w:rPr>
+          <w:rFonts w:ascii="Arial" w:hAnsi="Arial" w:cs="Arial"/>
+          <w:bCs/>
+          <w:sz w:val="24"/>
+          <w:szCs w:val="24"/>
+        </w:rPr>
+        <w:t>The project encompasses a dynamic website to showcase</w:t>
+      </w:r>
+      <w:r>
+        <w:rPr>
+          <w:rFonts w:ascii="Arial" w:hAnsi="Arial" w:cs="Arial"/>
+          <w:bCs/>
+          <w:sz w:val="24"/>
+          <w:szCs w:val="24"/>
+        </w:rPr>
+        <w:t xml:space="preserve"> charit</w:t>
+      </w:r>
+      <w:r>
+        <w:rPr>
+          <w:rFonts w:ascii="Arial" w:hAnsi="Arial" w:cs="Arial"/>
+          <w:bCs/>
+          <w:sz w:val="24"/>
+          <w:szCs w:val="24"/>
+        </w:rPr>
+        <w:t>able</w:t>
+      </w:r>
+      <w:r>
+        <w:rPr>
+          <w:rFonts w:ascii="Arial" w:hAnsi="Arial" w:cs="Arial"/>
+          <w:bCs/>
+          <w:sz w:val="24"/>
+          <w:szCs w:val="24"/>
+        </w:rPr>
+        <w:t xml:space="preserve"> events within the North Coast region. The website will provide members of the public</w:t>
+      </w:r>
+      <w:r>
+        <w:rPr>
+          <w:rFonts w:ascii="Arial" w:hAnsi="Arial" w:cs="Arial"/>
+          <w:bCs/>
+          <w:sz w:val="24"/>
+          <w:szCs w:val="24"/>
+        </w:rPr>
+        <w:t xml:space="preserve"> with the ability to search, view, and register for these events. The proposed outcome in relation to developing this website is to</w:t>
+      </w:r>
+      <w:r>
+        <w:rPr>
+          <w:rFonts w:ascii="Arial" w:hAnsi="Arial" w:cs="Arial"/>
+          <w:bCs/>
+          <w:sz w:val="24"/>
+          <w:szCs w:val="24"/>
+        </w:rPr>
+        <w:t xml:space="preserve"> provide charities with a professional and effective platform to display their events. The overarching motivation for this project is to provide a platform, connecting members of the public to charitable events – nothing more, nothing less.</w:t>
+      </w:r>
     </w:p>
     <w:p>
       <w:pPr>
         <w:spacing w:after="0" w:line="480" w:lineRule="auto"/>
         <w:ind w:left="-6" w:hanging="11"/>
-        <w:rPr>
-          <w:rFonts w:ascii="Arial" w:hAnsi="Arial" w:cs="Arial"/>
-          <w:b/>
-        </w:rPr>
-      </w:pPr>
-      <w:r>
-        <w:rPr>
-          <w:rFonts w:ascii="Arial" w:hAnsi="Arial" w:cs="Arial"/>
-          <w:b/>
-        </w:rPr>
-        <w:t xml:space="preserve">Problem </w:t>
-      </w:r>
-      <w:r>
-        <w:rPr>
-          <w:rFonts w:ascii="Arial" w:hAnsi="Arial" w:cs="Arial"/>
-          <w:b/>
-        </w:rPr>
-        <w:t>Statement</w:t>
-      </w:r>
+        <w:jc w:val="both"/>
+        <w:rPr>
+          <w:rFonts w:ascii="Arial" w:hAnsi="Arial" w:cs="Arial"/>
+          <w:bCs/>
+          <w:sz w:val="24"/>
+          <w:szCs w:val="24"/>
+        </w:rPr>
+      </w:pPr>
     </w:p>
     <w:p>
       <w:pPr>
         <w:spacing w:after="0" w:line="480" w:lineRule="auto"/>
         <w:ind w:left="-6" w:hanging="11"/>
-        <w:rPr>
-          <w:rFonts w:ascii="Arial" w:hAnsi="Arial" w:cs="Arial"/>
-          <w:bCs/>
-        </w:rPr>
-      </w:pPr>
+        <w:jc w:val="both"/>
+        <w:rPr>
+          <w:rFonts w:ascii="Arial" w:hAnsi="Arial" w:cs="Arial"/>
+          <w:b/>
+          <w:sz w:val="24"/>
+          <w:szCs w:val="24"/>
+        </w:rPr>
+      </w:pPr>
+      <w:r>
+        <w:rPr>
+          <w:rFonts w:ascii="Arial" w:hAnsi="Arial" w:cs="Arial"/>
+          <w:b/>
+          <w:sz w:val="24"/>
+          <w:szCs w:val="24"/>
+        </w:rPr>
+        <w:t xml:space="preserve">Problem </w:t>
+      </w:r>
+      <w:r>
+        <w:rPr>
+          <w:rFonts w:ascii="Arial" w:hAnsi="Arial" w:cs="Arial"/>
+          <w:b/>
+          <w:sz w:val="24"/>
+          <w:szCs w:val="24"/>
+        </w:rPr>
+        <w:t>Statement</w:t>
+      </w:r>
+      <w:r>
+        <w:rPr>
+          <w:rFonts w:ascii="Arial" w:hAnsi="Arial" w:cs="Arial"/>
+          <w:b/>
+          <w:sz w:val="24"/>
+          <w:szCs w:val="24"/>
+        </w:rPr>
+        <w:t>:</w:t>
+      </w:r>
     </w:p>
     <w:p>
       <w:pPr>
         <w:spacing w:after="0" w:line="480" w:lineRule="auto"/>
         <w:ind w:left="-6" w:hanging="11"/>
-        <w:rPr>
-          <w:rFonts w:ascii="Arial" w:hAnsi="Arial" w:cs="Arial"/>
-          <w:b/>
-        </w:rPr>
-      </w:pPr>
-      <w:r>
-        <w:rPr>
-          <w:rFonts w:ascii="Arial" w:hAnsi="Arial" w:cs="Arial"/>
-          <w:b/>
-        </w:rPr>
-        <w:t xml:space="preserve">Solution </w:t>
+        <w:jc w:val="both"/>
+        <w:rPr>
+          <w:rFonts w:ascii="Arial" w:hAnsi="Arial" w:cs="Arial"/>
+          <w:bCs/>
+          <w:sz w:val="24"/>
+          <w:szCs w:val="24"/>
+        </w:rPr>
+      </w:pPr>
+      <w:r>
+        <w:rPr>
+          <w:rFonts w:ascii="Arial" w:hAnsi="Arial" w:cs="Arial"/>
+          <w:bCs/>
+          <w:sz w:val="24"/>
+          <w:szCs w:val="24"/>
+        </w:rPr>
+        <w:t xml:space="preserve">Charitable organisations along the North Coast do not have a uniform application where all events can be displayed. Consequently, individual organisations are dependent on print advertising, email campaigns, and social media posts. Although effective, it does not </w:t>
+      </w:r>
+      <w:r>
+        <w:rPr>
+          <w:rFonts w:ascii="Arial" w:hAnsi="Arial" w:cs="Arial"/>
+          <w:bCs/>
+          <w:sz w:val="24"/>
+          <w:szCs w:val="24"/>
+        </w:rPr>
+        <w:lastRenderedPageBreak/>
+        <w:t xml:space="preserve">allow members of the public to register for events through these modes, as well as compare events based on individual preferences. The application, that will be developed, complements these modes as it will function as a centralised repository and will </w:t>
+      </w:r>
+      <w:r>
+        <w:rPr>
+          <w:rFonts w:ascii="Arial" w:hAnsi="Arial" w:cs="Arial"/>
+          <w:bCs/>
+          <w:sz w:val="24"/>
+          <w:szCs w:val="24"/>
+        </w:rPr>
+        <w:t>encompass the desires of the individual user.</w:t>
       </w:r>
     </w:p>
     <w:p>
       <w:pPr>
         <w:spacing w:after="0" w:line="480" w:lineRule="auto"/>
         <w:ind w:left="-6" w:hanging="11"/>
-        <w:rPr>
-          <w:rStyle w:val="selected"/>
-          <w:sz w:val="21"/>
-          <w:szCs w:val="21"/>
-        </w:rPr>
-      </w:pPr>
-      <w:r>
-        <w:rPr>
-          <w:rStyle w:val="selected"/>
-          <w:sz w:val="21"/>
-          <w:szCs w:val="21"/>
-        </w:rPr>
-        <w:t>May relate to the client and server communication concept</w:t>
-      </w:r>
+        <w:jc w:val="both"/>
+        <w:rPr>
+          <w:rFonts w:ascii="Arial" w:hAnsi="Arial" w:cs="Arial"/>
+          <w:bCs/>
+          <w:sz w:val="24"/>
+          <w:szCs w:val="24"/>
+        </w:rPr>
+      </w:pPr>
     </w:p>
     <w:p>
       <w:pPr>
         <w:spacing w:after="0" w:line="480" w:lineRule="auto"/>
         <w:ind w:left="-6" w:hanging="11"/>
-        <w:rPr>
-          <w:rFonts w:ascii="Arial" w:hAnsi="Arial" w:cs="Arial"/>
-          <w:b/>
-        </w:rPr>
-      </w:pPr>
+        <w:jc w:val="both"/>
+        <w:rPr>
+          <w:rFonts w:ascii="Arial" w:hAnsi="Arial" w:cs="Arial"/>
+          <w:b/>
+          <w:sz w:val="24"/>
+          <w:szCs w:val="24"/>
+        </w:rPr>
+      </w:pPr>
+      <w:r>
+        <w:rPr>
+          <w:rFonts w:ascii="Arial" w:hAnsi="Arial" w:cs="Arial"/>
+          <w:b/>
+          <w:sz w:val="24"/>
+          <w:szCs w:val="24"/>
+        </w:rPr>
+        <w:t>Solution</w:t>
+      </w:r>
+      <w:r>
+        <w:rPr>
+          <w:rFonts w:ascii="Arial" w:hAnsi="Arial" w:cs="Arial"/>
+          <w:b/>
+          <w:sz w:val="24"/>
+          <w:szCs w:val="24"/>
+        </w:rPr>
+        <w:t>:</w:t>
+      </w:r>
     </w:p>
     <w:p>
       <w:pPr>
         <w:spacing w:after="0" w:line="480" w:lineRule="auto"/>
         <w:ind w:left="-6" w:hanging="11"/>
-        <w:rPr>
-          <w:rFonts w:ascii="Arial" w:hAnsi="Arial" w:cs="Arial"/>
-          <w:b/>
-        </w:rPr>
-      </w:pPr>
-      <w:r>
-        <w:rPr>
-          <w:rFonts w:ascii="Arial" w:hAnsi="Arial" w:cs="Arial"/>
-          <w:b/>
+        <w:jc w:val="both"/>
+        <w:rPr>
+          <w:rFonts w:ascii="Arial" w:hAnsi="Arial" w:cs="Arial"/>
+          <w:b/>
+          <w:sz w:val="24"/>
+          <w:szCs w:val="24"/>
+        </w:rPr>
+      </w:pPr>
+      <w:r>
+        <w:rPr>
+          <w:rFonts w:ascii="Arial" w:hAnsi="Arial" w:cs="Arial"/>
+          <w:b/>
+          <w:sz w:val="24"/>
+          <w:szCs w:val="24"/>
         </w:rPr>
         <w:t>Web UX</w:t>
+      </w:r>
+      <w:r>
+        <w:rPr>
+          <w:rFonts w:ascii="Arial" w:hAnsi="Arial" w:cs="Arial"/>
+          <w:b/>
+          <w:sz w:val="24"/>
+          <w:szCs w:val="24"/>
+        </w:rPr>
+        <w:t>:</w:t>
       </w:r>
     </w:p>
     <w:p>
       <w:pPr>
         <w:spacing w:after="0" w:line="480" w:lineRule="auto"/>
-        <w:ind w:left="-6" w:hanging="11"/>
-        <w:rPr>
-          <w:rStyle w:val="selected"/>
-          <w:sz w:val="21"/>
-          <w:szCs w:val="21"/>
-        </w:rPr>
-      </w:pPr>
-      <w:r>
-        <w:rPr>
-          <w:rStyle w:val="selected"/>
-          <w:sz w:val="21"/>
-          <w:szCs w:val="21"/>
-        </w:rPr>
-        <w:t>How did you ensure the application is intuitive and easy to use? (e.g., wireframing, navigation).</w:t>
+        <w:ind w:left="0" w:firstLine="0"/>
+        <w:jc w:val="both"/>
+        <w:rPr>
+          <w:rFonts w:ascii="Arial" w:hAnsi="Arial" w:cs="Arial"/>
+          <w:b/>
+          <w:sz w:val="24"/>
+          <w:szCs w:val="24"/>
+        </w:rPr>
+      </w:pPr>
+      <w:r>
+        <w:rPr>
+          <w:rFonts w:ascii="Arial" w:hAnsi="Arial" w:cs="Arial"/>
+          <w:b/>
+          <w:sz w:val="24"/>
+          <w:szCs w:val="24"/>
+        </w:rPr>
+        <w:t>Data Schema</w:t>
+      </w:r>
+      <w:r>
+        <w:rPr>
+          <w:rFonts w:ascii="Arial" w:hAnsi="Arial" w:cs="Arial"/>
+          <w:b/>
+          <w:sz w:val="24"/>
+          <w:szCs w:val="24"/>
+        </w:rPr>
+        <w:t>:</w:t>
       </w:r>
     </w:p>
     <w:p>
       <w:pPr>
         <w:spacing w:after="0" w:line="480" w:lineRule="auto"/>
-        <w:ind w:left="-6" w:hanging="11"/>
-        <w:rPr>
-          <w:rStyle w:val="selected"/>
-          <w:sz w:val="21"/>
-          <w:szCs w:val="21"/>
-        </w:rPr>
-      </w:pPr>
-    </w:p>
-    <w:p>
-      <w:pPr>
-        <w:spacing w:after="0" w:line="480" w:lineRule="auto"/>
-        <w:ind w:left="-6" w:hanging="11"/>
-        <w:rPr>
-          <w:rFonts w:ascii="Arial" w:hAnsi="Arial" w:cs="Arial"/>
-          <w:b/>
-        </w:rPr>
-      </w:pPr>
-      <w:r>
-        <w:rPr>
-          <w:rFonts w:ascii="Arial" w:hAnsi="Arial" w:cs="Arial"/>
-          <w:b/>
-        </w:rPr>
-        <w:t xml:space="preserve">Data Schema </w:t>
-      </w:r>
-    </w:p>
-    <w:p>
-      <w:pPr>
-        <w:spacing w:after="0" w:line="480" w:lineRule="auto"/>
-        <w:ind w:left="-6" w:hanging="11"/>
-        <w:rPr>
-          <w:rStyle w:val="selected"/>
-          <w:sz w:val="21"/>
-          <w:szCs w:val="21"/>
-        </w:rPr>
-      </w:pPr>
-      <w:r>
-        <w:rPr>
-          <w:rStyle w:val="selected"/>
-          <w:sz w:val="21"/>
-          <w:szCs w:val="21"/>
-        </w:rPr>
-        <w:t>Provide a high-level overview of your data model including the relationship between entities.</w:t>
-      </w:r>
-    </w:p>
-    <w:p>
-      <w:pPr>
-        <w:spacing w:after="0" w:line="480" w:lineRule="auto"/>
-        <w:ind w:left="-6" w:hanging="11"/>
-        <w:rPr>
-          <w:rFonts w:ascii="Arial" w:hAnsi="Arial" w:cs="Arial"/>
-          <w:b/>
-        </w:rPr>
-      </w:pPr>
-    </w:p>
-    <w:p>
-      <w:pPr>
-        <w:spacing w:after="0" w:line="480" w:lineRule="auto"/>
-        <w:ind w:left="-6" w:hanging="11"/>
-        <w:rPr>
-          <w:rFonts w:ascii="Arial" w:hAnsi="Arial" w:cs="Arial"/>
-          <w:b/>
-        </w:rPr>
-      </w:pPr>
-      <w:r>
-        <w:rPr>
-          <w:rFonts w:ascii="Arial" w:hAnsi="Arial" w:cs="Arial"/>
-          <w:b/>
-        </w:rPr>
-        <w:t xml:space="preserve">API design </w:t>
-      </w:r>
-    </w:p>
-    <w:p>
-      <w:pPr>
-        <w:pStyle w:val="ListParagraph"/>
-        <w:numPr>
-          <w:ilvl w:val="0"/>
-          <w:numId w:val="1"/>
-        </w:numPr>
-        <w:spacing w:after="0" w:line="480" w:lineRule="auto"/>
-        <w:rPr>
-          <w:rStyle w:val="selected"/>
-          <w:sz w:val="21"/>
-          <w:szCs w:val="21"/>
-        </w:rPr>
-      </w:pPr>
-      <w:r>
-        <w:rPr>
-          <w:rStyle w:val="selected"/>
-          <w:sz w:val="21"/>
-          <w:szCs w:val="21"/>
-        </w:rPr>
-        <w:t>List the main API endpoints of your application (e.g., GET /</w:t>
-      </w:r>
-      <w:proofErr w:type="spellStart"/>
-      <w:r>
-        <w:rPr>
-          <w:rStyle w:val="selected"/>
-          <w:sz w:val="21"/>
-          <w:szCs w:val="21"/>
-        </w:rPr>
-        <w:t>api</w:t>
-      </w:r>
-      <w:proofErr w:type="spellEnd"/>
-      <w:r>
-        <w:rPr>
-          <w:rStyle w:val="selected"/>
-          <w:sz w:val="21"/>
-          <w:szCs w:val="21"/>
-        </w:rPr>
-        <w:t>/users, POST /</w:t>
-      </w:r>
-      <w:proofErr w:type="spellStart"/>
-      <w:r>
-        <w:rPr>
-          <w:rStyle w:val="selected"/>
-          <w:sz w:val="21"/>
-          <w:szCs w:val="21"/>
-        </w:rPr>
-        <w:t>api</w:t>
-      </w:r>
-      <w:proofErr w:type="spellEnd"/>
-      <w:r>
-        <w:rPr>
-          <w:rStyle w:val="selected"/>
-          <w:sz w:val="21"/>
-          <w:szCs w:val="21"/>
-        </w:rPr>
-        <w:t>/posts).</w:t>
-      </w:r>
-    </w:p>
-    <w:p>
-      <w:pPr>
-        <w:pStyle w:val="ListParagraph"/>
-        <w:numPr>
-          <w:ilvl w:val="0"/>
-          <w:numId w:val="1"/>
-        </w:numPr>
-        <w:spacing w:after="0" w:line="480" w:lineRule="auto"/>
-        <w:rPr>
-          <w:rStyle w:val="selected"/>
-          <w:sz w:val="21"/>
-          <w:szCs w:val="21"/>
-        </w:rPr>
-      </w:pPr>
-      <w:r>
-        <w:rPr>
-          <w:rStyle w:val="selected"/>
-          <w:sz w:val="21"/>
-          <w:szCs w:val="21"/>
-        </w:rPr>
-        <w:t>For a single API endpoint, describe its purpose, the data it expects to receive (request body), and the data it will return (response body).</w:t>
-      </w:r>
-    </w:p>
-    <w:p>
-      <w:pPr>
-        <w:pStyle w:val="ListParagraph"/>
-        <w:numPr>
-          <w:ilvl w:val="0"/>
-          <w:numId w:val="1"/>
-        </w:numPr>
-        <w:spacing w:after="0" w:line="480" w:lineRule="auto"/>
-        <w:rPr>
-          <w:rStyle w:val="selected"/>
-          <w:sz w:val="21"/>
-          <w:szCs w:val="21"/>
-        </w:rPr>
-      </w:pPr>
-      <w:r>
-        <w:rPr>
-          <w:rStyle w:val="selected"/>
-          <w:sz w:val="21"/>
-          <w:szCs w:val="21"/>
-        </w:rPr>
-        <w:t>Explain your choice of HTTP methods (GET, POST, PUT, DELETE, etc.) for each endpoint.</w:t>
-      </w:r>
-    </w:p>
-    <w:p>
-      <w:pPr>
-        <w:spacing w:after="120" w:line="360" w:lineRule="auto"/>
-        <w:ind w:left="-6" w:hanging="11"/>
-        <w:rPr>
-          <w:rStyle w:val="selected"/>
-        </w:rPr>
-      </w:pPr>
-    </w:p>
-    <w:p>
-      <w:pPr>
-        <w:spacing w:after="120" w:line="360" w:lineRule="auto"/>
         <w:ind w:left="0" w:firstLine="0"/>
-        <w:rPr>
-          <w:rFonts w:ascii="Arial" w:hAnsi="Arial" w:cs="Arial"/>
-          <w:bCs/>
-        </w:rPr>
-      </w:pPr>
+        <w:jc w:val="both"/>
+        <w:rPr>
+          <w:rFonts w:ascii="Arial" w:hAnsi="Arial" w:cs="Arial"/>
+          <w:b/>
+          <w:sz w:val="24"/>
+          <w:szCs w:val="24"/>
+        </w:rPr>
+      </w:pPr>
+      <w:r>
+        <w:rPr>
+          <w:rFonts w:ascii="Arial" w:hAnsi="Arial" w:cs="Arial"/>
+          <w:b/>
+          <w:sz w:val="24"/>
+          <w:szCs w:val="24"/>
+        </w:rPr>
+        <w:t>API design</w:t>
+      </w:r>
+      <w:r>
+        <w:rPr>
+          <w:rFonts w:ascii="Arial" w:hAnsi="Arial" w:cs="Arial"/>
+          <w:b/>
+          <w:sz w:val="24"/>
+          <w:szCs w:val="24"/>
+        </w:rPr>
+        <w:t>:</w:t>
+      </w:r>
     </w:p>
     <w:sectPr>
-      <w:pgSz w:w="11906" w:h="16838"/>
+      <w:pgSz w:w="16838" w:h="11906" w:orient="landscape"/>
       <w:pgMar w:top="1440" w:right="1440" w:bottom="1440" w:left="1440" w:header="720" w:footer="720" w:gutter="0"/>
       <w:cols w:space="720"/>
+      <w:docGrid w:linePitch="299"/>
     </w:sectPr>
   </w:body>
 </w:document>

</xml_diff>

<commit_message>
Finalised the remainder of the report.
</commit_message>
<xml_diff>
--- a/Report.docx
+++ b/Report.docx
@@ -318,7 +318,16 @@
           <w:sz w:val="24"/>
           <w:szCs w:val="24"/>
         </w:rPr>
-        <w:t>North Coast Charity Events Consolidated Website</w:t>
+        <w:t>Kempsey</w:t>
+      </w:r>
+      <w:r>
+        <w:rPr>
+          <w:rFonts w:ascii="Arial" w:hAnsi="Arial" w:cs="Arial"/>
+          <w:bCs/>
+          <w:sz w:val="24"/>
+          <w:szCs w:val="24"/>
+        </w:rPr>
+        <w:t xml:space="preserve"> Charity Events Consolidated Website</w:t>
       </w:r>
     </w:p>
     <w:p>
@@ -429,7 +438,25 @@
           <w:sz w:val="24"/>
           <w:szCs w:val="24"/>
         </w:rPr>
-        <w:t xml:space="preserve"> events within the North Coast region. The website will provide members of the public</w:t>
+        <w:t xml:space="preserve"> events within the </w:t>
+      </w:r>
+      <w:r>
+        <w:rPr>
+          <w:rFonts w:ascii="Arial" w:hAnsi="Arial" w:cs="Arial"/>
+          <w:bCs/>
+          <w:sz w:val="24"/>
+          <w:szCs w:val="24"/>
+        </w:rPr>
+        <w:t>City of Kempsey</w:t>
+      </w:r>
+      <w:r>
+        <w:rPr>
+          <w:rFonts w:ascii="Arial" w:hAnsi="Arial" w:cs="Arial"/>
+          <w:bCs/>
+          <w:sz w:val="24"/>
+          <w:szCs w:val="24"/>
+        </w:rPr>
+        <w:t>. The website will provide members of the public</w:t>
       </w:r>
       <w:r>
         <w:rPr>
@@ -522,7 +549,36 @@
           <w:sz w:val="24"/>
           <w:szCs w:val="24"/>
         </w:rPr>
-        <w:t xml:space="preserve">Charitable organisations along the North Coast do not have a uniform application where all events can be displayed. Consequently, individual organisations are dependent on print advertising, email campaigns, and social media posts. Although effective, it does not </w:t>
+        <w:t xml:space="preserve">Charitable organisations </w:t>
+      </w:r>
+      <w:r>
+        <w:rPr>
+          <w:rFonts w:ascii="Arial" w:hAnsi="Arial" w:cs="Arial"/>
+          <w:bCs/>
+          <w:sz w:val="24"/>
+          <w:szCs w:val="24"/>
+        </w:rPr>
+        <w:t xml:space="preserve">within the </w:t>
+      </w:r>
+      <w:proofErr w:type="gramStart"/>
+      <w:r>
+        <w:rPr>
+          <w:rFonts w:ascii="Arial" w:hAnsi="Arial" w:cs="Arial"/>
+          <w:bCs/>
+          <w:sz w:val="24"/>
+          <w:szCs w:val="24"/>
+        </w:rPr>
+        <w:t>City</w:t>
+      </w:r>
+      <w:proofErr w:type="gramEnd"/>
+      <w:r>
+        <w:rPr>
+          <w:rFonts w:ascii="Arial" w:hAnsi="Arial" w:cs="Arial"/>
+          <w:bCs/>
+          <w:sz w:val="24"/>
+          <w:szCs w:val="24"/>
+        </w:rPr>
+        <w:t xml:space="preserve"> do not have a uniform application where all events can be displayed. Consequently, individual organisations are dependent on print advertising, email campaigns, and social media posts. Although effective, it does not allow </w:t>
       </w:r>
       <w:r>
         <w:rPr>
@@ -532,7 +588,25 @@
           <w:szCs w:val="24"/>
         </w:rPr>
         <w:lastRenderedPageBreak/>
-        <w:t xml:space="preserve">allow members of the public to register for events through these modes, as well as compare events based on individual preferences. The application, that will be developed, complements these modes as it will function as a centralised repository and will </w:t>
+        <w:t>members of the public to register for events through these modes, as well as compare events based on individual preferences. The application, that will be developed, complements these modes as it will function</w:t>
+      </w:r>
+      <w:r>
+        <w:rPr>
+          <w:rFonts w:ascii="Arial" w:hAnsi="Arial" w:cs="Arial"/>
+          <w:bCs/>
+          <w:sz w:val="24"/>
+          <w:szCs w:val="24"/>
+        </w:rPr>
+        <w:t xml:space="preserve"> </w:t>
+      </w:r>
+      <w:r>
+        <w:rPr>
+          <w:rFonts w:ascii="Arial" w:hAnsi="Arial" w:cs="Arial"/>
+          <w:bCs/>
+          <w:sz w:val="24"/>
+          <w:szCs w:val="24"/>
+        </w:rPr>
+        <w:t xml:space="preserve">as a centralised repository and will </w:t>
       </w:r>
       <w:r>
         <w:rPr>
@@ -595,6 +669,351 @@
         <w:jc w:val="both"/>
         <w:rPr>
           <w:rFonts w:ascii="Arial" w:hAnsi="Arial" w:cs="Arial"/>
+          <w:bCs/>
+          <w:sz w:val="24"/>
+          <w:szCs w:val="24"/>
+        </w:rPr>
+      </w:pPr>
+      <w:r>
+        <w:rPr>
+          <w:rFonts w:ascii="Arial" w:hAnsi="Arial" w:cs="Arial"/>
+          <w:bCs/>
+          <w:sz w:val="24"/>
+          <w:szCs w:val="24"/>
+        </w:rPr>
+        <w:t xml:space="preserve">The solution to address the problem </w:t>
+      </w:r>
+      <w:r>
+        <w:rPr>
+          <w:rFonts w:ascii="Arial" w:hAnsi="Arial" w:cs="Arial"/>
+          <w:bCs/>
+          <w:sz w:val="24"/>
+          <w:szCs w:val="24"/>
+        </w:rPr>
+        <w:t>was developing</w:t>
+      </w:r>
+      <w:r>
+        <w:rPr>
+          <w:rFonts w:ascii="Arial" w:hAnsi="Arial" w:cs="Arial"/>
+          <w:bCs/>
+          <w:sz w:val="24"/>
+          <w:szCs w:val="24"/>
+        </w:rPr>
+        <w:t xml:space="preserve"> a dynamic website that renders information automatically via</w:t>
+      </w:r>
+      <w:r>
+        <w:rPr>
+          <w:rFonts w:ascii="Arial" w:hAnsi="Arial" w:cs="Arial"/>
+          <w:bCs/>
+          <w:sz w:val="24"/>
+          <w:szCs w:val="24"/>
+        </w:rPr>
+        <w:t xml:space="preserve"> Application Programming Interfaces from the database. The application incorporates a client-server side architecture to ensure charitable event details are accurate, accessible, and interactive on any device.</w:t>
+      </w:r>
+    </w:p>
+    <w:p>
+      <w:pPr>
+        <w:pStyle w:val="ListParagraph"/>
+        <w:numPr>
+          <w:ilvl w:val="0"/>
+          <w:numId w:val="2"/>
+        </w:numPr>
+        <w:spacing w:after="0" w:line="480" w:lineRule="auto"/>
+        <w:jc w:val="both"/>
+        <w:rPr>
+          <w:rFonts w:ascii="Arial" w:hAnsi="Arial" w:cs="Arial"/>
+          <w:bCs/>
+          <w:sz w:val="24"/>
+          <w:szCs w:val="24"/>
+        </w:rPr>
+      </w:pPr>
+      <w:r>
+        <w:rPr>
+          <w:rFonts w:ascii="Arial" w:hAnsi="Arial" w:cs="Arial"/>
+          <w:bCs/>
+          <w:sz w:val="24"/>
+          <w:szCs w:val="24"/>
+        </w:rPr>
+        <w:t>A function</w:t>
+      </w:r>
+      <w:r>
+        <w:rPr>
+          <w:rFonts w:ascii="Arial" w:hAnsi="Arial" w:cs="Arial"/>
+          <w:bCs/>
+          <w:sz w:val="24"/>
+          <w:szCs w:val="24"/>
+        </w:rPr>
+        <w:t>al</w:t>
+      </w:r>
+      <w:r>
+        <w:rPr>
+          <w:rFonts w:ascii="Arial" w:hAnsi="Arial" w:cs="Arial"/>
+          <w:bCs/>
+          <w:sz w:val="24"/>
+          <w:szCs w:val="24"/>
+        </w:rPr>
+        <w:t xml:space="preserve"> </w:t>
+      </w:r>
+      <w:proofErr w:type="spellStart"/>
+      <w:r>
+        <w:rPr>
+          <w:rFonts w:ascii="Arial" w:hAnsi="Arial" w:cs="Arial"/>
+          <w:bCs/>
+          <w:sz w:val="24"/>
+          <w:szCs w:val="24"/>
+        </w:rPr>
+        <w:t>mySQL</w:t>
+      </w:r>
+      <w:proofErr w:type="spellEnd"/>
+      <w:r>
+        <w:rPr>
+          <w:rFonts w:ascii="Arial" w:hAnsi="Arial" w:cs="Arial"/>
+          <w:bCs/>
+          <w:sz w:val="24"/>
+          <w:szCs w:val="24"/>
+        </w:rPr>
+        <w:t xml:space="preserve"> database </w:t>
+      </w:r>
+      <w:r>
+        <w:rPr>
+          <w:rFonts w:ascii="Arial" w:hAnsi="Arial" w:cs="Arial"/>
+          <w:bCs/>
+          <w:sz w:val="24"/>
+          <w:szCs w:val="24"/>
+        </w:rPr>
+        <w:t>was</w:t>
+      </w:r>
+      <w:r>
+        <w:rPr>
+          <w:rFonts w:ascii="Arial" w:hAnsi="Arial" w:cs="Arial"/>
+          <w:bCs/>
+          <w:sz w:val="24"/>
+          <w:szCs w:val="24"/>
+        </w:rPr>
+        <w:t xml:space="preserve"> developed to store categories, donation data, event and organisation data, as well as ticket information data.</w:t>
+      </w:r>
+    </w:p>
+    <w:p>
+      <w:pPr>
+        <w:pStyle w:val="ListParagraph"/>
+        <w:numPr>
+          <w:ilvl w:val="0"/>
+          <w:numId w:val="2"/>
+        </w:numPr>
+        <w:spacing w:after="0" w:line="480" w:lineRule="auto"/>
+        <w:jc w:val="both"/>
+        <w:rPr>
+          <w:rFonts w:ascii="Arial" w:hAnsi="Arial" w:cs="Arial"/>
+          <w:bCs/>
+          <w:sz w:val="24"/>
+          <w:szCs w:val="24"/>
+        </w:rPr>
+      </w:pPr>
+      <w:r>
+        <w:rPr>
+          <w:rFonts w:ascii="Arial" w:hAnsi="Arial" w:cs="Arial"/>
+          <w:bCs/>
+          <w:sz w:val="24"/>
+          <w:szCs w:val="24"/>
+        </w:rPr>
+        <w:t xml:space="preserve">A dynamic and accessible front-end </w:t>
+      </w:r>
+      <w:r>
+        <w:rPr>
+          <w:rFonts w:ascii="Arial" w:hAnsi="Arial" w:cs="Arial"/>
+          <w:bCs/>
+          <w:sz w:val="24"/>
+          <w:szCs w:val="24"/>
+        </w:rPr>
+        <w:t>was</w:t>
+      </w:r>
+      <w:r>
+        <w:rPr>
+          <w:rFonts w:ascii="Arial" w:hAnsi="Arial" w:cs="Arial"/>
+          <w:bCs/>
+          <w:sz w:val="24"/>
+          <w:szCs w:val="24"/>
+        </w:rPr>
+        <w:t xml:space="preserve"> developed, ensuring there is a clear navigation bar across all pages. A flexible layout, implemented via CSS assist</w:t>
+      </w:r>
+      <w:r>
+        <w:rPr>
+          <w:rFonts w:ascii="Arial" w:hAnsi="Arial" w:cs="Arial"/>
+          <w:bCs/>
+          <w:sz w:val="24"/>
+          <w:szCs w:val="24"/>
+        </w:rPr>
+        <w:t>ed</w:t>
+      </w:r>
+      <w:r>
+        <w:rPr>
+          <w:rFonts w:ascii="Arial" w:hAnsi="Arial" w:cs="Arial"/>
+          <w:bCs/>
+          <w:sz w:val="24"/>
+          <w:szCs w:val="24"/>
+        </w:rPr>
+        <w:t xml:space="preserve"> in ensuring the application is viewable across all devices. Search filters through a form </w:t>
+      </w:r>
+      <w:r>
+        <w:rPr>
+          <w:rFonts w:ascii="Arial" w:hAnsi="Arial" w:cs="Arial"/>
+          <w:bCs/>
+          <w:sz w:val="24"/>
+          <w:szCs w:val="24"/>
+        </w:rPr>
+        <w:t xml:space="preserve">assisted </w:t>
+      </w:r>
+      <w:r>
+        <w:rPr>
+          <w:rFonts w:ascii="Arial" w:hAnsi="Arial" w:cs="Arial"/>
+          <w:bCs/>
+          <w:sz w:val="24"/>
+          <w:szCs w:val="24"/>
+        </w:rPr>
+        <w:t xml:space="preserve">in returning events </w:t>
+      </w:r>
+      <w:r>
+        <w:rPr>
+          <w:rFonts w:ascii="Arial" w:hAnsi="Arial" w:cs="Arial"/>
+          <w:bCs/>
+          <w:sz w:val="24"/>
+          <w:szCs w:val="24"/>
+        </w:rPr>
+        <w:t xml:space="preserve">via an API, </w:t>
+      </w:r>
+      <w:r>
+        <w:rPr>
+          <w:rFonts w:ascii="Arial" w:hAnsi="Arial" w:cs="Arial"/>
+          <w:bCs/>
+          <w:sz w:val="24"/>
+          <w:szCs w:val="24"/>
+        </w:rPr>
+        <w:t xml:space="preserve">dependent on the values an individual </w:t>
+      </w:r>
+      <w:proofErr w:type="gramStart"/>
+      <w:r>
+        <w:rPr>
+          <w:rFonts w:ascii="Arial" w:hAnsi="Arial" w:cs="Arial"/>
+          <w:bCs/>
+          <w:sz w:val="24"/>
+          <w:szCs w:val="24"/>
+        </w:rPr>
+        <w:t>enters into</w:t>
+      </w:r>
+      <w:proofErr w:type="gramEnd"/>
+      <w:r>
+        <w:rPr>
+          <w:rFonts w:ascii="Arial" w:hAnsi="Arial" w:cs="Arial"/>
+          <w:bCs/>
+          <w:sz w:val="24"/>
+          <w:szCs w:val="24"/>
+        </w:rPr>
+        <w:t xml:space="preserve"> the form. On the homepage</w:t>
+      </w:r>
+      <w:r>
+        <w:rPr>
+          <w:rFonts w:ascii="Arial" w:hAnsi="Arial" w:cs="Arial"/>
+          <w:bCs/>
+          <w:sz w:val="24"/>
+          <w:szCs w:val="24"/>
+        </w:rPr>
+        <w:t>, the API returned all events, displaying them in an intuitive format.</w:t>
+      </w:r>
+    </w:p>
+    <w:p>
+      <w:pPr>
+        <w:pStyle w:val="ListParagraph"/>
+        <w:numPr>
+          <w:ilvl w:val="0"/>
+          <w:numId w:val="2"/>
+        </w:numPr>
+        <w:spacing w:after="0" w:line="480" w:lineRule="auto"/>
+        <w:jc w:val="both"/>
+        <w:rPr>
+          <w:rFonts w:ascii="Arial" w:hAnsi="Arial" w:cs="Arial"/>
+          <w:bCs/>
+          <w:sz w:val="24"/>
+          <w:szCs w:val="24"/>
+        </w:rPr>
+      </w:pPr>
+      <w:r>
+        <w:rPr>
+          <w:rFonts w:ascii="Arial" w:hAnsi="Arial" w:cs="Arial"/>
+          <w:bCs/>
+          <w:sz w:val="24"/>
+          <w:szCs w:val="24"/>
+        </w:rPr>
+        <w:lastRenderedPageBreak/>
+        <w:t xml:space="preserve">RESTful APIs </w:t>
+      </w:r>
+      <w:r>
+        <w:rPr>
+          <w:rFonts w:ascii="Arial" w:hAnsi="Arial" w:cs="Arial"/>
+          <w:bCs/>
+          <w:sz w:val="24"/>
+          <w:szCs w:val="24"/>
+        </w:rPr>
+        <w:t>were</w:t>
+      </w:r>
+      <w:r>
+        <w:rPr>
+          <w:rFonts w:ascii="Arial" w:hAnsi="Arial" w:cs="Arial"/>
+          <w:bCs/>
+          <w:sz w:val="24"/>
+          <w:szCs w:val="24"/>
+        </w:rPr>
+        <w:t xml:space="preserve"> developed to provide a bridge between the front-end of the application and the database.</w:t>
+      </w:r>
+      <w:r>
+        <w:rPr>
+          <w:rFonts w:ascii="Arial" w:hAnsi="Arial" w:cs="Arial"/>
+          <w:bCs/>
+          <w:sz w:val="24"/>
+          <w:szCs w:val="24"/>
+        </w:rPr>
+        <w:t xml:space="preserve"> These </w:t>
+      </w:r>
+      <w:proofErr w:type="gramStart"/>
+      <w:r>
+        <w:rPr>
+          <w:rFonts w:ascii="Arial" w:hAnsi="Arial" w:cs="Arial"/>
+          <w:bCs/>
+          <w:sz w:val="24"/>
+          <w:szCs w:val="24"/>
+        </w:rPr>
+        <w:t>API’s</w:t>
+      </w:r>
+      <w:proofErr w:type="gramEnd"/>
+      <w:r>
+        <w:rPr>
+          <w:rFonts w:ascii="Arial" w:hAnsi="Arial" w:cs="Arial"/>
+          <w:bCs/>
+          <w:sz w:val="24"/>
+          <w:szCs w:val="24"/>
+        </w:rPr>
+        <w:t xml:space="preserve"> ensured that information can be returned dynamically. Endpoints were utilised to return information from multiple database tables.</w:t>
+      </w:r>
+    </w:p>
+    <w:p>
+      <w:pPr>
+        <w:spacing w:after="0" w:line="480" w:lineRule="auto"/>
+        <w:ind w:left="-6" w:hanging="11"/>
+        <w:jc w:val="both"/>
+        <w:rPr>
+          <w:rFonts w:ascii="Arial" w:hAnsi="Arial" w:cs="Arial"/>
+          <w:b/>
+          <w:sz w:val="24"/>
+          <w:szCs w:val="24"/>
+        </w:rPr>
+      </w:pPr>
+    </w:p>
+    <w:p>
+      <w:pPr>
+        <w:spacing w:after="0" w:line="480" w:lineRule="auto"/>
+        <w:ind w:left="-6" w:hanging="11"/>
+        <w:jc w:val="both"/>
+        <w:rPr>
+          <w:rFonts w:ascii="Arial" w:hAnsi="Arial" w:cs="Arial"/>
           <w:b/>
           <w:sz w:val="24"/>
           <w:szCs w:val="24"/>
@@ -626,29 +1045,223 @@
         <w:jc w:val="both"/>
         <w:rPr>
           <w:rFonts w:ascii="Arial" w:hAnsi="Arial" w:cs="Arial"/>
-          <w:b/>
-          <w:sz w:val="24"/>
-          <w:szCs w:val="24"/>
-        </w:rPr>
-      </w:pPr>
-      <w:r>
-        <w:rPr>
-          <w:rFonts w:ascii="Arial" w:hAnsi="Arial" w:cs="Arial"/>
-          <w:b/>
-          <w:sz w:val="24"/>
-          <w:szCs w:val="24"/>
-        </w:rPr>
-        <w:t>Data Schema</w:t>
-      </w:r>
-      <w:r>
-        <w:rPr>
-          <w:rFonts w:ascii="Arial" w:hAnsi="Arial" w:cs="Arial"/>
-          <w:b/>
+          <w:bCs/>
+          <w:sz w:val="24"/>
+          <w:szCs w:val="24"/>
+        </w:rPr>
+      </w:pPr>
+      <w:r>
+        <w:rPr>
+          <w:rFonts w:ascii="Arial" w:hAnsi="Arial" w:cs="Arial"/>
+          <w:bCs/>
+          <w:sz w:val="24"/>
+          <w:szCs w:val="24"/>
+        </w:rPr>
+        <w:t>The application was developed with simplicity and consistency in mind. A navigation bar featuring the title of the application on</w:t>
+      </w:r>
+      <w:r>
+        <w:rPr>
+          <w:rFonts w:ascii="Arial" w:hAnsi="Arial" w:cs="Arial"/>
+          <w:bCs/>
+          <w:sz w:val="24"/>
+          <w:szCs w:val="24"/>
+        </w:rPr>
+        <w:t xml:space="preserve"> the left-hand-side and the page links on the right-hand-side was developed and displayed prominently on all pages. Throughout the website, elements were styled using flex attributes to ensure the application was viewable and responsive across all device-types. When displaying the retrieved events, each event was encapsulated in </w:t>
+      </w:r>
+      <w:proofErr w:type="spellStart"/>
+      <w:proofErr w:type="gramStart"/>
+      <w:r>
+        <w:rPr>
+          <w:rFonts w:ascii="Arial" w:hAnsi="Arial" w:cs="Arial"/>
+          <w:bCs/>
+          <w:sz w:val="24"/>
+          <w:szCs w:val="24"/>
+        </w:rPr>
+        <w:t>it’s</w:t>
+      </w:r>
+      <w:proofErr w:type="spellEnd"/>
+      <w:proofErr w:type="gramEnd"/>
+      <w:r>
+        <w:rPr>
+          <w:rFonts w:ascii="Arial" w:hAnsi="Arial" w:cs="Arial"/>
+          <w:bCs/>
+          <w:sz w:val="24"/>
+          <w:szCs w:val="24"/>
+        </w:rPr>
+        <w:t xml:space="preserve"> own divisional element, with a prominent border around the element. From an individual’s perspective, this will assist in distinguishing individual events. A consistent font, sizing and colouring scheme was utilised throughout</w:t>
+      </w:r>
+      <w:r>
+        <w:rPr>
+          <w:rFonts w:ascii="Arial" w:hAnsi="Arial" w:cs="Arial"/>
+          <w:bCs/>
           <w:sz w:val="24"/>
           <w:szCs w:val="24"/>
         </w:rPr>
         <w:t>:</w:t>
       </w:r>
+    </w:p>
+    <w:p>
+      <w:pPr>
+        <w:pStyle w:val="ListParagraph"/>
+        <w:numPr>
+          <w:ilvl w:val="0"/>
+          <w:numId w:val="4"/>
+        </w:numPr>
+        <w:spacing w:after="0" w:line="480" w:lineRule="auto"/>
+        <w:jc w:val="both"/>
+        <w:rPr>
+          <w:rFonts w:ascii="Arial" w:hAnsi="Arial" w:cs="Arial"/>
+          <w:bCs/>
+          <w:sz w:val="24"/>
+          <w:szCs w:val="24"/>
+        </w:rPr>
+      </w:pPr>
+      <w:r>
+        <w:rPr>
+          <w:rFonts w:ascii="Arial" w:hAnsi="Arial" w:cs="Arial"/>
+          <w:bCs/>
+          <w:sz w:val="24"/>
+          <w:szCs w:val="24"/>
+        </w:rPr>
+        <w:t>W</w:t>
+      </w:r>
+      <w:r>
+        <w:rPr>
+          <w:rFonts w:ascii="Arial" w:hAnsi="Arial" w:cs="Arial"/>
+          <w:bCs/>
+          <w:sz w:val="24"/>
+          <w:szCs w:val="24"/>
+        </w:rPr>
+        <w:t xml:space="preserve">arm navy blues and greens </w:t>
+      </w:r>
+      <w:r>
+        <w:rPr>
+          <w:rFonts w:ascii="Arial" w:hAnsi="Arial" w:cs="Arial"/>
+          <w:bCs/>
+          <w:sz w:val="24"/>
+          <w:szCs w:val="24"/>
+        </w:rPr>
+        <w:t xml:space="preserve">were </w:t>
+      </w:r>
+      <w:r>
+        <w:rPr>
+          <w:rFonts w:ascii="Arial" w:hAnsi="Arial" w:cs="Arial"/>
+          <w:bCs/>
+          <w:sz w:val="24"/>
+          <w:szCs w:val="24"/>
+        </w:rPr>
+        <w:t>utilised for the header elements</w:t>
+      </w:r>
+      <w:r>
+        <w:rPr>
+          <w:rFonts w:ascii="Arial" w:hAnsi="Arial" w:cs="Arial"/>
+          <w:bCs/>
+          <w:sz w:val="24"/>
+          <w:szCs w:val="24"/>
+        </w:rPr>
+        <w:t>.</w:t>
+      </w:r>
+    </w:p>
+    <w:p>
+      <w:pPr>
+        <w:pStyle w:val="ListParagraph"/>
+        <w:numPr>
+          <w:ilvl w:val="0"/>
+          <w:numId w:val="4"/>
+        </w:numPr>
+        <w:spacing w:after="0" w:line="480" w:lineRule="auto"/>
+        <w:jc w:val="both"/>
+        <w:rPr>
+          <w:rFonts w:ascii="Arial" w:hAnsi="Arial" w:cs="Arial"/>
+          <w:bCs/>
+          <w:sz w:val="24"/>
+          <w:szCs w:val="24"/>
+        </w:rPr>
+      </w:pPr>
+      <w:r>
+        <w:rPr>
+          <w:rFonts w:ascii="Arial" w:hAnsi="Arial" w:cs="Arial"/>
+          <w:bCs/>
+          <w:sz w:val="24"/>
+          <w:szCs w:val="24"/>
+        </w:rPr>
+        <w:t>W</w:t>
+      </w:r>
+      <w:r>
+        <w:rPr>
+          <w:rFonts w:ascii="Arial" w:hAnsi="Arial" w:cs="Arial"/>
+          <w:bCs/>
+          <w:sz w:val="24"/>
+          <w:szCs w:val="24"/>
+        </w:rPr>
+        <w:t>hite</w:t>
+      </w:r>
+      <w:r>
+        <w:rPr>
+          <w:rFonts w:ascii="Arial" w:hAnsi="Arial" w:cs="Arial"/>
+          <w:bCs/>
+          <w:sz w:val="24"/>
+          <w:szCs w:val="24"/>
+        </w:rPr>
+        <w:t xml:space="preserve"> and contrasting greys were utilised </w:t>
+      </w:r>
+      <w:r>
+        <w:rPr>
+          <w:rFonts w:ascii="Arial" w:hAnsi="Arial" w:cs="Arial"/>
+          <w:bCs/>
+          <w:sz w:val="24"/>
+          <w:szCs w:val="24"/>
+        </w:rPr>
+        <w:t>for the navigation and footer elem</w:t>
+      </w:r>
+      <w:r>
+        <w:rPr>
+          <w:rFonts w:ascii="Arial" w:hAnsi="Arial" w:cs="Arial"/>
+          <w:bCs/>
+          <w:sz w:val="24"/>
+          <w:szCs w:val="24"/>
+        </w:rPr>
+        <w:t>ents.</w:t>
+      </w:r>
+    </w:p>
+    <w:p>
+      <w:pPr>
+        <w:pStyle w:val="ListParagraph"/>
+        <w:numPr>
+          <w:ilvl w:val="0"/>
+          <w:numId w:val="4"/>
+        </w:numPr>
+        <w:spacing w:after="0" w:line="480" w:lineRule="auto"/>
+        <w:jc w:val="both"/>
+        <w:rPr>
+          <w:rFonts w:ascii="Arial" w:hAnsi="Arial" w:cs="Arial"/>
+          <w:bCs/>
+          <w:sz w:val="24"/>
+          <w:szCs w:val="24"/>
+        </w:rPr>
+      </w:pPr>
+      <w:r>
+        <w:rPr>
+          <w:rFonts w:ascii="Arial" w:hAnsi="Arial" w:cs="Arial"/>
+          <w:bCs/>
+          <w:sz w:val="24"/>
+          <w:szCs w:val="24"/>
+        </w:rPr>
+        <w:t>Black was utilised for the paragraph elements.</w:t>
+      </w:r>
+    </w:p>
+    <w:p>
+      <w:pPr>
+        <w:spacing w:after="0" w:line="480" w:lineRule="auto"/>
+        <w:ind w:left="-6" w:hanging="11"/>
+        <w:jc w:val="both"/>
+        <w:rPr>
+          <w:rFonts w:ascii="Arial" w:hAnsi="Arial" w:cs="Arial"/>
+          <w:b/>
+          <w:sz w:val="24"/>
+          <w:szCs w:val="24"/>
+        </w:rPr>
+      </w:pPr>
     </w:p>
     <w:p>
       <w:pPr>
@@ -669,7 +1282,7 @@
           <w:sz w:val="24"/>
           <w:szCs w:val="24"/>
         </w:rPr>
-        <w:t>API design</w:t>
+        <w:t>Data Schema</w:t>
       </w:r>
       <w:r>
         <w:rPr>
@@ -679,6 +1292,355 @@
           <w:szCs w:val="24"/>
         </w:rPr>
         <w:t>:</w:t>
+      </w:r>
+    </w:p>
+    <w:p>
+      <w:pPr>
+        <w:spacing w:after="0" w:line="480" w:lineRule="auto"/>
+        <w:ind w:left="0" w:firstLine="0"/>
+        <w:jc w:val="both"/>
+        <w:rPr>
+          <w:rFonts w:ascii="Arial" w:hAnsi="Arial" w:cs="Arial"/>
+          <w:bCs/>
+          <w:sz w:val="24"/>
+          <w:szCs w:val="24"/>
+        </w:rPr>
+      </w:pPr>
+      <w:r>
+        <w:rPr>
+          <w:rFonts w:ascii="Arial" w:hAnsi="Arial" w:cs="Arial"/>
+          <w:bCs/>
+          <w:sz w:val="24"/>
+          <w:szCs w:val="24"/>
+        </w:rPr>
+        <w:lastRenderedPageBreak/>
+        <w:t>Please find attached an Entity Relationship Diagram which assisted in developing the database schema required for the application.</w:t>
+      </w:r>
+    </w:p>
+    <w:p>
+      <w:pPr>
+        <w:spacing w:after="0" w:line="480" w:lineRule="auto"/>
+        <w:ind w:left="0" w:firstLine="0"/>
+        <w:jc w:val="center"/>
+        <w:rPr>
+          <w:rFonts w:ascii="Arial" w:hAnsi="Arial" w:cs="Arial"/>
+          <w:bCs/>
+          <w:sz w:val="24"/>
+          <w:szCs w:val="24"/>
+        </w:rPr>
+      </w:pPr>
+      <w:r>
+        <w:rPr>
+          <w:rFonts w:ascii="Arial" w:hAnsi="Arial" w:cs="Arial"/>
+          <w:bCs/>
+          <w:noProof/>
+          <w:sz w:val="24"/>
+          <w:szCs w:val="24"/>
+        </w:rPr>
+        <w:drawing>
+          <wp:inline distT="0" distB="0" distL="0" distR="0" wp14:anchorId="578BFB9F" wp14:editId="3E0BFE6A">
+            <wp:extent cx="6480000" cy="3960000"/>
+            <wp:effectExtent l="25400" t="25400" r="86360" b="91440"/>
+            <wp:docPr id="1532993506" name="Picture 1"/>
+            <wp:cNvGraphicFramePr>
+              <a:graphicFrameLocks xmlns:a="http://schemas.openxmlformats.org/drawingml/2006/main"/>
+            </wp:cNvGraphicFramePr>
+            <a:graphic xmlns:a="http://schemas.openxmlformats.org/drawingml/2006/main">
+              <a:graphicData uri="http://schemas.openxmlformats.org/drawingml/2006/picture">
+                <pic:pic xmlns:pic="http://schemas.openxmlformats.org/drawingml/2006/picture">
+                  <pic:nvPicPr>
+                    <pic:cNvPr id="1532993506" name="Picture 1532993506"/>
+                    <pic:cNvPicPr/>
+                  </pic:nvPicPr>
+                  <pic:blipFill>
+                    <a:blip r:embed="rId8">
+                      <a:extLst>
+                        <a:ext uri="{28A0092B-C50C-407E-A947-70E740481C1C}">
+                          <a14:useLocalDpi xmlns:a14="http://schemas.microsoft.com/office/drawing/2010/main" val="0"/>
+                        </a:ext>
+                      </a:extLst>
+                    </a:blip>
+                    <a:stretch>
+                      <a:fillRect/>
+                    </a:stretch>
+                  </pic:blipFill>
+                  <pic:spPr>
+                    <a:xfrm>
+                      <a:off x="0" y="0"/>
+                      <a:ext cx="6480000" cy="3960000"/>
+                    </a:xfrm>
+                    <a:prstGeom prst="rect">
+                      <a:avLst/>
+                    </a:prstGeom>
+                    <a:effectLst>
+                      <a:outerShdw blurRad="50800" dist="38100" dir="2700000" algn="tl" rotWithShape="0">
+                        <a:prstClr val="black">
+                          <a:alpha val="40000"/>
+                        </a:prstClr>
+                      </a:outerShdw>
+                    </a:effectLst>
+                  </pic:spPr>
+                </pic:pic>
+              </a:graphicData>
+            </a:graphic>
+          </wp:inline>
+        </w:drawing>
+      </w:r>
+    </w:p>
+    <w:p>
+      <w:pPr>
+        <w:spacing w:after="0" w:line="480" w:lineRule="auto"/>
+        <w:ind w:left="0" w:firstLine="0"/>
+        <w:jc w:val="both"/>
+        <w:rPr>
+          <w:rFonts w:ascii="Arial" w:hAnsi="Arial" w:cs="Arial"/>
+          <w:bCs/>
+          <w:sz w:val="24"/>
+          <w:szCs w:val="24"/>
+        </w:rPr>
+      </w:pPr>
+    </w:p>
+    <w:p>
+      <w:pPr>
+        <w:spacing w:after="0" w:line="480" w:lineRule="auto"/>
+        <w:ind w:left="0" w:firstLine="0"/>
+        <w:jc w:val="both"/>
+        <w:rPr>
+          <w:rFonts w:ascii="Arial" w:hAnsi="Arial" w:cs="Arial"/>
+          <w:b/>
+          <w:sz w:val="24"/>
+          <w:szCs w:val="24"/>
+        </w:rPr>
+      </w:pPr>
+      <w:r>
+        <w:rPr>
+          <w:rFonts w:ascii="Arial" w:hAnsi="Arial" w:cs="Arial"/>
+          <w:b/>
+          <w:sz w:val="24"/>
+          <w:szCs w:val="24"/>
+        </w:rPr>
+        <w:t xml:space="preserve">API </w:t>
+      </w:r>
+      <w:r>
+        <w:rPr>
+          <w:rFonts w:ascii="Arial" w:hAnsi="Arial" w:cs="Arial"/>
+          <w:b/>
+          <w:sz w:val="24"/>
+          <w:szCs w:val="24"/>
+        </w:rPr>
+        <w:t>D</w:t>
+      </w:r>
+      <w:r>
+        <w:rPr>
+          <w:rFonts w:ascii="Arial" w:hAnsi="Arial" w:cs="Arial"/>
+          <w:b/>
+          <w:sz w:val="24"/>
+          <w:szCs w:val="24"/>
+        </w:rPr>
+        <w:t>esign</w:t>
+      </w:r>
+      <w:r>
+        <w:rPr>
+          <w:rFonts w:ascii="Arial" w:hAnsi="Arial" w:cs="Arial"/>
+          <w:b/>
+          <w:sz w:val="24"/>
+          <w:szCs w:val="24"/>
+        </w:rPr>
+        <w:t>:</w:t>
+      </w:r>
+    </w:p>
+    <w:p>
+      <w:pPr>
+        <w:pStyle w:val="ListParagraph"/>
+        <w:numPr>
+          <w:ilvl w:val="0"/>
+          <w:numId w:val="5"/>
+        </w:numPr>
+        <w:spacing w:after="0" w:line="480" w:lineRule="auto"/>
+        <w:jc w:val="both"/>
+        <w:rPr>
+          <w:rFonts w:ascii="Arial" w:hAnsi="Arial" w:cs="Arial"/>
+          <w:bCs/>
+          <w:sz w:val="24"/>
+          <w:szCs w:val="24"/>
+        </w:rPr>
+      </w:pPr>
+      <w:r>
+        <w:rPr>
+          <w:rFonts w:ascii="Arial" w:hAnsi="Arial" w:cs="Arial"/>
+          <w:bCs/>
+          <w:sz w:val="24"/>
+          <w:szCs w:val="24"/>
+        </w:rPr>
+        <w:t>GET /</w:t>
+      </w:r>
+      <w:proofErr w:type="spellStart"/>
+      <w:r>
+        <w:rPr>
+          <w:rFonts w:ascii="Arial" w:hAnsi="Arial" w:cs="Arial"/>
+          <w:bCs/>
+          <w:sz w:val="24"/>
+          <w:szCs w:val="24"/>
+        </w:rPr>
+        <w:t>api</w:t>
+      </w:r>
+      <w:proofErr w:type="spellEnd"/>
+      <w:r>
+        <w:rPr>
+          <w:rFonts w:ascii="Arial" w:hAnsi="Arial" w:cs="Arial"/>
+          <w:bCs/>
+          <w:sz w:val="24"/>
+          <w:szCs w:val="24"/>
+        </w:rPr>
+        <w:t>/events which returns all upcoming events as shown in the event entity in the diagram above.</w:t>
+      </w:r>
+    </w:p>
+    <w:p>
+      <w:pPr>
+        <w:pStyle w:val="ListParagraph"/>
+        <w:numPr>
+          <w:ilvl w:val="0"/>
+          <w:numId w:val="5"/>
+        </w:numPr>
+        <w:spacing w:after="0" w:line="480" w:lineRule="auto"/>
+        <w:jc w:val="both"/>
+        <w:rPr>
+          <w:rFonts w:ascii="Arial" w:hAnsi="Arial" w:cs="Arial"/>
+          <w:bCs/>
+          <w:sz w:val="24"/>
+          <w:szCs w:val="24"/>
+        </w:rPr>
+      </w:pPr>
+      <w:r>
+        <w:rPr>
+          <w:rFonts w:ascii="Arial" w:hAnsi="Arial" w:cs="Arial"/>
+          <w:bCs/>
+          <w:sz w:val="24"/>
+          <w:szCs w:val="24"/>
+        </w:rPr>
+        <w:lastRenderedPageBreak/>
+        <w:t>GET /</w:t>
+      </w:r>
+      <w:proofErr w:type="spellStart"/>
+      <w:r>
+        <w:rPr>
+          <w:rFonts w:ascii="Arial" w:hAnsi="Arial" w:cs="Arial"/>
+          <w:bCs/>
+          <w:sz w:val="24"/>
+          <w:szCs w:val="24"/>
+        </w:rPr>
+        <w:t>api</w:t>
+      </w:r>
+      <w:proofErr w:type="spellEnd"/>
+      <w:r>
+        <w:rPr>
+          <w:rFonts w:ascii="Arial" w:hAnsi="Arial" w:cs="Arial"/>
+          <w:bCs/>
+          <w:sz w:val="24"/>
+          <w:szCs w:val="24"/>
+        </w:rPr>
+        <w:t xml:space="preserve">/events/search </w:t>
+      </w:r>
+      <w:r>
+        <w:rPr>
+          <w:rFonts w:ascii="Arial" w:hAnsi="Arial" w:cs="Arial"/>
+          <w:bCs/>
+          <w:sz w:val="24"/>
+          <w:szCs w:val="24"/>
+        </w:rPr>
+        <w:t>which filters events by start date, location, and category.</w:t>
+      </w:r>
+    </w:p>
+    <w:p>
+      <w:pPr>
+        <w:pStyle w:val="ListParagraph"/>
+        <w:numPr>
+          <w:ilvl w:val="0"/>
+          <w:numId w:val="5"/>
+        </w:numPr>
+        <w:spacing w:after="0" w:line="480" w:lineRule="auto"/>
+        <w:jc w:val="both"/>
+        <w:rPr>
+          <w:rFonts w:ascii="Arial" w:hAnsi="Arial" w:cs="Arial"/>
+          <w:bCs/>
+          <w:sz w:val="24"/>
+          <w:szCs w:val="24"/>
+        </w:rPr>
+      </w:pPr>
+      <w:r>
+        <w:rPr>
+          <w:rFonts w:ascii="Arial" w:hAnsi="Arial" w:cs="Arial"/>
+          <w:bCs/>
+          <w:sz w:val="24"/>
+          <w:szCs w:val="24"/>
+        </w:rPr>
+        <w:t>GET /</w:t>
+      </w:r>
+      <w:proofErr w:type="spellStart"/>
+      <w:r>
+        <w:rPr>
+          <w:rFonts w:ascii="Arial" w:hAnsi="Arial" w:cs="Arial"/>
+          <w:bCs/>
+          <w:sz w:val="24"/>
+          <w:szCs w:val="24"/>
+        </w:rPr>
+        <w:t>api</w:t>
+      </w:r>
+      <w:proofErr w:type="spellEnd"/>
+      <w:r>
+        <w:rPr>
+          <w:rFonts w:ascii="Arial" w:hAnsi="Arial" w:cs="Arial"/>
+          <w:bCs/>
+          <w:sz w:val="24"/>
+          <w:szCs w:val="24"/>
+        </w:rPr>
+        <w:t>/events/:id which returns a complete event for a specific event id.</w:t>
+      </w:r>
+    </w:p>
+    <w:p>
+      <w:pPr>
+        <w:pStyle w:val="ListParagraph"/>
+        <w:numPr>
+          <w:ilvl w:val="0"/>
+          <w:numId w:val="5"/>
+        </w:numPr>
+        <w:spacing w:after="0" w:line="480" w:lineRule="auto"/>
+        <w:jc w:val="both"/>
+        <w:rPr>
+          <w:rFonts w:ascii="Arial" w:hAnsi="Arial" w:cs="Arial"/>
+          <w:bCs/>
+          <w:sz w:val="24"/>
+          <w:szCs w:val="24"/>
+        </w:rPr>
+      </w:pPr>
+      <w:r>
+        <w:rPr>
+          <w:rFonts w:ascii="Arial" w:hAnsi="Arial" w:cs="Arial"/>
+          <w:bCs/>
+          <w:sz w:val="24"/>
+          <w:szCs w:val="24"/>
+        </w:rPr>
+        <w:t>GET /</w:t>
+      </w:r>
+      <w:proofErr w:type="spellStart"/>
+      <w:r>
+        <w:rPr>
+          <w:rFonts w:ascii="Arial" w:hAnsi="Arial" w:cs="Arial"/>
+          <w:bCs/>
+          <w:sz w:val="24"/>
+          <w:szCs w:val="24"/>
+        </w:rPr>
+        <w:t>api</w:t>
+      </w:r>
+      <w:proofErr w:type="spellEnd"/>
+      <w:r>
+        <w:rPr>
+          <w:rFonts w:ascii="Arial" w:hAnsi="Arial" w:cs="Arial"/>
+          <w:bCs/>
+          <w:sz w:val="24"/>
+          <w:szCs w:val="24"/>
+        </w:rPr>
+        <w:t>/categories which returns all categories for the search form dropdown.</w:t>
       </w:r>
     </w:p>
     <w:sectPr>
@@ -694,6 +1656,119 @@
 <file path=word/numbering.xml><?xml version="1.0" encoding="utf-8"?>
 <w:numbering xmlns:wpc="http://schemas.microsoft.com/office/word/2010/wordprocessingCanvas" xmlns:cx="http://schemas.microsoft.com/office/drawing/2014/chartex" xmlns:cx1="http://schemas.microsoft.com/office/drawing/2015/9/8/chartex" xmlns:cx2="http://schemas.microsoft.com/office/drawing/2015/10/21/chartex" xmlns:cx3="http://schemas.microsoft.com/office/drawing/2016/5/9/chartex" xmlns:cx4="http://schemas.microsoft.com/office/drawing/2016/5/10/chartex" xmlns:cx5="http://schemas.microsoft.com/office/drawing/2016/5/11/chartex" xmlns:cx6="http://schemas.microsoft.com/office/drawing/2016/5/12/chartex" xmlns:cx7="http://schemas.microsoft.com/office/drawing/2016/5/13/chartex" xmlns:cx8="http://schemas.microsoft.com/office/drawing/2016/5/14/chartex" xmlns:mc="http://schemas.openxmlformats.org/markup-compatibility/2006" xmlns:aink="http://schemas.microsoft.com/office/drawing/2016/ink" xmlns:am3d="http://schemas.microsoft.com/office/drawing/2017/model3d" xmlns:o="urn:schemas-microsoft-com:office:office" xmlns:oel="http://schemas.microsoft.com/office/2019/extlst" xmlns:r="http://schemas.openxmlformats.org/officeDocument/2006/relationships" xmlns:m="http://schemas.openxmlformats.org/officeDocument/2006/math" xmlns:v="urn:schemas-microsoft-com:vml" xmlns:wp14="http://schemas.microsoft.com/office/word/2010/wordprocessingDrawing" xmlns:wp="http://schemas.openxmlformats.org/drawingml/2006/wordprocessingDrawing" xmlns:w10="urn:schemas-microsoft-com:office:word" xmlns:w="http://schemas.openxmlformats.org/wordprocessingml/2006/main" xmlns:w14="http://schemas.microsoft.com/office/word/2010/wordml" xmlns:w15="http://schemas.microsoft.com/office/word/2012/wordml" xmlns:w16cex="http://schemas.microsoft.com/office/word/2018/wordml/cex" xmlns:w16cid="http://schemas.microsoft.com/office/word/2016/wordml/cid" xmlns:w16="http://schemas.microsoft.com/office/word/2018/wordml" xmlns:w16du="http://schemas.microsoft.com/office/word/2023/wordml/word16du" xmlns:w16sdtdh="http://schemas.microsoft.com/office/word/2020/wordml/sdtdatahash" xmlns:w16sdtfl="http://schemas.microsoft.com/office/word/2024/wordml/sdtformatlock" xmlns:w16se="http://schemas.microsoft.com/office/word/2015/wordml/symex" xmlns:wpg="http://schemas.microsoft.com/office/word/2010/wordprocessingGroup" xmlns:wpi="http://schemas.microsoft.com/office/word/2010/wordprocessingInk" xmlns:wne="http://schemas.microsoft.com/office/word/2006/wordml" xmlns:wps="http://schemas.microsoft.com/office/word/2010/wordprocessingShape" mc:Ignorable="w14 w15 w16se w16cid w16 w16cex w16sdtdh w16sdtfl w16du wp14">
   <w:abstractNum w:abstractNumId="0" w15:restartNumberingAfterBreak="0">
+    <w:nsid w:val="0A3E2B78"/>
+    <w:multiLevelType w:val="hybridMultilevel"/>
+    <w:tmpl w:val="AAC4C1DA"/>
+    <w:lvl w:ilvl="0" w:tplc="08090001">
+      <w:start w:val="1"/>
+      <w:numFmt w:val="bullet"/>
+      <w:lvlText w:val=""/>
+      <w:lvlJc w:val="left"/>
+      <w:pPr>
+        <w:ind w:left="703" w:hanging="360"/>
+      </w:pPr>
+      <w:rPr>
+        <w:rFonts w:ascii="Symbol" w:hAnsi="Symbol" w:hint="default"/>
+      </w:rPr>
+    </w:lvl>
+    <w:lvl w:ilvl="1" w:tplc="08090003" w:tentative="1">
+      <w:start w:val="1"/>
+      <w:numFmt w:val="bullet"/>
+      <w:lvlText w:val="o"/>
+      <w:lvlJc w:val="left"/>
+      <w:pPr>
+        <w:ind w:left="1423" w:hanging="360"/>
+      </w:pPr>
+      <w:rPr>
+        <w:rFonts w:ascii="Courier New" w:hAnsi="Courier New" w:cs="Courier New" w:hint="default"/>
+      </w:rPr>
+    </w:lvl>
+    <w:lvl w:ilvl="2" w:tplc="08090005" w:tentative="1">
+      <w:start w:val="1"/>
+      <w:numFmt w:val="bullet"/>
+      <w:lvlText w:val=""/>
+      <w:lvlJc w:val="left"/>
+      <w:pPr>
+        <w:ind w:left="2143" w:hanging="360"/>
+      </w:pPr>
+      <w:rPr>
+        <w:rFonts w:ascii="Wingdings" w:hAnsi="Wingdings" w:hint="default"/>
+      </w:rPr>
+    </w:lvl>
+    <w:lvl w:ilvl="3" w:tplc="08090001" w:tentative="1">
+      <w:start w:val="1"/>
+      <w:numFmt w:val="bullet"/>
+      <w:lvlText w:val=""/>
+      <w:lvlJc w:val="left"/>
+      <w:pPr>
+        <w:ind w:left="2863" w:hanging="360"/>
+      </w:pPr>
+      <w:rPr>
+        <w:rFonts w:ascii="Symbol" w:hAnsi="Symbol" w:hint="default"/>
+      </w:rPr>
+    </w:lvl>
+    <w:lvl w:ilvl="4" w:tplc="08090003" w:tentative="1">
+      <w:start w:val="1"/>
+      <w:numFmt w:val="bullet"/>
+      <w:lvlText w:val="o"/>
+      <w:lvlJc w:val="left"/>
+      <w:pPr>
+        <w:ind w:left="3583" w:hanging="360"/>
+      </w:pPr>
+      <w:rPr>
+        <w:rFonts w:ascii="Courier New" w:hAnsi="Courier New" w:cs="Courier New" w:hint="default"/>
+      </w:rPr>
+    </w:lvl>
+    <w:lvl w:ilvl="5" w:tplc="08090005" w:tentative="1">
+      <w:start w:val="1"/>
+      <w:numFmt w:val="bullet"/>
+      <w:lvlText w:val=""/>
+      <w:lvlJc w:val="left"/>
+      <w:pPr>
+        <w:ind w:left="4303" w:hanging="360"/>
+      </w:pPr>
+      <w:rPr>
+        <w:rFonts w:ascii="Wingdings" w:hAnsi="Wingdings" w:hint="default"/>
+      </w:rPr>
+    </w:lvl>
+    <w:lvl w:ilvl="6" w:tplc="08090001" w:tentative="1">
+      <w:start w:val="1"/>
+      <w:numFmt w:val="bullet"/>
+      <w:lvlText w:val=""/>
+      <w:lvlJc w:val="left"/>
+      <w:pPr>
+        <w:ind w:left="5023" w:hanging="360"/>
+      </w:pPr>
+      <w:rPr>
+        <w:rFonts w:ascii="Symbol" w:hAnsi="Symbol" w:hint="default"/>
+      </w:rPr>
+    </w:lvl>
+    <w:lvl w:ilvl="7" w:tplc="08090003" w:tentative="1">
+      <w:start w:val="1"/>
+      <w:numFmt w:val="bullet"/>
+      <w:lvlText w:val="o"/>
+      <w:lvlJc w:val="left"/>
+      <w:pPr>
+        <w:ind w:left="5743" w:hanging="360"/>
+      </w:pPr>
+      <w:rPr>
+        <w:rFonts w:ascii="Courier New" w:hAnsi="Courier New" w:cs="Courier New" w:hint="default"/>
+      </w:rPr>
+    </w:lvl>
+    <w:lvl w:ilvl="8" w:tplc="08090005" w:tentative="1">
+      <w:start w:val="1"/>
+      <w:numFmt w:val="bullet"/>
+      <w:lvlText w:val=""/>
+      <w:lvlJc w:val="left"/>
+      <w:pPr>
+        <w:ind w:left="6463" w:hanging="360"/>
+      </w:pPr>
+      <w:rPr>
+        <w:rFonts w:ascii="Wingdings" w:hAnsi="Wingdings" w:hint="default"/>
+      </w:rPr>
+    </w:lvl>
+  </w:abstractNum>
+  <w:abstractNum w:abstractNumId="1" w15:restartNumberingAfterBreak="0">
     <w:nsid w:val="37A576E2"/>
     <w:multiLevelType w:val="hybridMultilevel"/>
     <w:tmpl w:val="2C0293FA"/>
@@ -806,8 +1881,359 @@
       </w:rPr>
     </w:lvl>
   </w:abstractNum>
+  <w:abstractNum w:abstractNumId="2" w15:restartNumberingAfterBreak="0">
+    <w:nsid w:val="3C804524"/>
+    <w:multiLevelType w:val="hybridMultilevel"/>
+    <w:tmpl w:val="4BE642F8"/>
+    <w:lvl w:ilvl="0" w:tplc="08090001">
+      <w:start w:val="1"/>
+      <w:numFmt w:val="bullet"/>
+      <w:lvlText w:val=""/>
+      <w:lvlJc w:val="left"/>
+      <w:pPr>
+        <w:ind w:left="703" w:hanging="360"/>
+      </w:pPr>
+      <w:rPr>
+        <w:rFonts w:ascii="Symbol" w:hAnsi="Symbol" w:hint="default"/>
+      </w:rPr>
+    </w:lvl>
+    <w:lvl w:ilvl="1" w:tplc="08090003" w:tentative="1">
+      <w:start w:val="1"/>
+      <w:numFmt w:val="bullet"/>
+      <w:lvlText w:val="o"/>
+      <w:lvlJc w:val="left"/>
+      <w:pPr>
+        <w:ind w:left="1423" w:hanging="360"/>
+      </w:pPr>
+      <w:rPr>
+        <w:rFonts w:ascii="Courier New" w:hAnsi="Courier New" w:cs="Courier New" w:hint="default"/>
+      </w:rPr>
+    </w:lvl>
+    <w:lvl w:ilvl="2" w:tplc="08090005" w:tentative="1">
+      <w:start w:val="1"/>
+      <w:numFmt w:val="bullet"/>
+      <w:lvlText w:val=""/>
+      <w:lvlJc w:val="left"/>
+      <w:pPr>
+        <w:ind w:left="2143" w:hanging="360"/>
+      </w:pPr>
+      <w:rPr>
+        <w:rFonts w:ascii="Wingdings" w:hAnsi="Wingdings" w:hint="default"/>
+      </w:rPr>
+    </w:lvl>
+    <w:lvl w:ilvl="3" w:tplc="08090001" w:tentative="1">
+      <w:start w:val="1"/>
+      <w:numFmt w:val="bullet"/>
+      <w:lvlText w:val=""/>
+      <w:lvlJc w:val="left"/>
+      <w:pPr>
+        <w:ind w:left="2863" w:hanging="360"/>
+      </w:pPr>
+      <w:rPr>
+        <w:rFonts w:ascii="Symbol" w:hAnsi="Symbol" w:hint="default"/>
+      </w:rPr>
+    </w:lvl>
+    <w:lvl w:ilvl="4" w:tplc="08090003" w:tentative="1">
+      <w:start w:val="1"/>
+      <w:numFmt w:val="bullet"/>
+      <w:lvlText w:val="o"/>
+      <w:lvlJc w:val="left"/>
+      <w:pPr>
+        <w:ind w:left="3583" w:hanging="360"/>
+      </w:pPr>
+      <w:rPr>
+        <w:rFonts w:ascii="Courier New" w:hAnsi="Courier New" w:cs="Courier New" w:hint="default"/>
+      </w:rPr>
+    </w:lvl>
+    <w:lvl w:ilvl="5" w:tplc="08090005" w:tentative="1">
+      <w:start w:val="1"/>
+      <w:numFmt w:val="bullet"/>
+      <w:lvlText w:val=""/>
+      <w:lvlJc w:val="left"/>
+      <w:pPr>
+        <w:ind w:left="4303" w:hanging="360"/>
+      </w:pPr>
+      <w:rPr>
+        <w:rFonts w:ascii="Wingdings" w:hAnsi="Wingdings" w:hint="default"/>
+      </w:rPr>
+    </w:lvl>
+    <w:lvl w:ilvl="6" w:tplc="08090001" w:tentative="1">
+      <w:start w:val="1"/>
+      <w:numFmt w:val="bullet"/>
+      <w:lvlText w:val=""/>
+      <w:lvlJc w:val="left"/>
+      <w:pPr>
+        <w:ind w:left="5023" w:hanging="360"/>
+      </w:pPr>
+      <w:rPr>
+        <w:rFonts w:ascii="Symbol" w:hAnsi="Symbol" w:hint="default"/>
+      </w:rPr>
+    </w:lvl>
+    <w:lvl w:ilvl="7" w:tplc="08090003" w:tentative="1">
+      <w:start w:val="1"/>
+      <w:numFmt w:val="bullet"/>
+      <w:lvlText w:val="o"/>
+      <w:lvlJc w:val="left"/>
+      <w:pPr>
+        <w:ind w:left="5743" w:hanging="360"/>
+      </w:pPr>
+      <w:rPr>
+        <w:rFonts w:ascii="Courier New" w:hAnsi="Courier New" w:cs="Courier New" w:hint="default"/>
+      </w:rPr>
+    </w:lvl>
+    <w:lvl w:ilvl="8" w:tplc="08090005" w:tentative="1">
+      <w:start w:val="1"/>
+      <w:numFmt w:val="bullet"/>
+      <w:lvlText w:val=""/>
+      <w:lvlJc w:val="left"/>
+      <w:pPr>
+        <w:ind w:left="6463" w:hanging="360"/>
+      </w:pPr>
+      <w:rPr>
+        <w:rFonts w:ascii="Wingdings" w:hAnsi="Wingdings" w:hint="default"/>
+      </w:rPr>
+    </w:lvl>
+  </w:abstractNum>
+  <w:abstractNum w:abstractNumId="3" w15:restartNumberingAfterBreak="0">
+    <w:nsid w:val="5A3C73E7"/>
+    <w:multiLevelType w:val="hybridMultilevel"/>
+    <w:tmpl w:val="713A35A6"/>
+    <w:lvl w:ilvl="0" w:tplc="08090001">
+      <w:start w:val="1"/>
+      <w:numFmt w:val="bullet"/>
+      <w:lvlText w:val=""/>
+      <w:lvlJc w:val="left"/>
+      <w:pPr>
+        <w:ind w:left="720" w:hanging="360"/>
+      </w:pPr>
+      <w:rPr>
+        <w:rFonts w:ascii="Symbol" w:hAnsi="Symbol" w:hint="default"/>
+      </w:rPr>
+    </w:lvl>
+    <w:lvl w:ilvl="1" w:tplc="08090003" w:tentative="1">
+      <w:start w:val="1"/>
+      <w:numFmt w:val="bullet"/>
+      <w:lvlText w:val="o"/>
+      <w:lvlJc w:val="left"/>
+      <w:pPr>
+        <w:ind w:left="1440" w:hanging="360"/>
+      </w:pPr>
+      <w:rPr>
+        <w:rFonts w:ascii="Courier New" w:hAnsi="Courier New" w:cs="Courier New" w:hint="default"/>
+      </w:rPr>
+    </w:lvl>
+    <w:lvl w:ilvl="2" w:tplc="08090005" w:tentative="1">
+      <w:start w:val="1"/>
+      <w:numFmt w:val="bullet"/>
+      <w:lvlText w:val=""/>
+      <w:lvlJc w:val="left"/>
+      <w:pPr>
+        <w:ind w:left="2160" w:hanging="360"/>
+      </w:pPr>
+      <w:rPr>
+        <w:rFonts w:ascii="Wingdings" w:hAnsi="Wingdings" w:hint="default"/>
+      </w:rPr>
+    </w:lvl>
+    <w:lvl w:ilvl="3" w:tplc="08090001" w:tentative="1">
+      <w:start w:val="1"/>
+      <w:numFmt w:val="bullet"/>
+      <w:lvlText w:val=""/>
+      <w:lvlJc w:val="left"/>
+      <w:pPr>
+        <w:ind w:left="2880" w:hanging="360"/>
+      </w:pPr>
+      <w:rPr>
+        <w:rFonts w:ascii="Symbol" w:hAnsi="Symbol" w:hint="default"/>
+      </w:rPr>
+    </w:lvl>
+    <w:lvl w:ilvl="4" w:tplc="08090003" w:tentative="1">
+      <w:start w:val="1"/>
+      <w:numFmt w:val="bullet"/>
+      <w:lvlText w:val="o"/>
+      <w:lvlJc w:val="left"/>
+      <w:pPr>
+        <w:ind w:left="3600" w:hanging="360"/>
+      </w:pPr>
+      <w:rPr>
+        <w:rFonts w:ascii="Courier New" w:hAnsi="Courier New" w:cs="Courier New" w:hint="default"/>
+      </w:rPr>
+    </w:lvl>
+    <w:lvl w:ilvl="5" w:tplc="08090005" w:tentative="1">
+      <w:start w:val="1"/>
+      <w:numFmt w:val="bullet"/>
+      <w:lvlText w:val=""/>
+      <w:lvlJc w:val="left"/>
+      <w:pPr>
+        <w:ind w:left="4320" w:hanging="360"/>
+      </w:pPr>
+      <w:rPr>
+        <w:rFonts w:ascii="Wingdings" w:hAnsi="Wingdings" w:hint="default"/>
+      </w:rPr>
+    </w:lvl>
+    <w:lvl w:ilvl="6" w:tplc="08090001" w:tentative="1">
+      <w:start w:val="1"/>
+      <w:numFmt w:val="bullet"/>
+      <w:lvlText w:val=""/>
+      <w:lvlJc w:val="left"/>
+      <w:pPr>
+        <w:ind w:left="5040" w:hanging="360"/>
+      </w:pPr>
+      <w:rPr>
+        <w:rFonts w:ascii="Symbol" w:hAnsi="Symbol" w:hint="default"/>
+      </w:rPr>
+    </w:lvl>
+    <w:lvl w:ilvl="7" w:tplc="08090003" w:tentative="1">
+      <w:start w:val="1"/>
+      <w:numFmt w:val="bullet"/>
+      <w:lvlText w:val="o"/>
+      <w:lvlJc w:val="left"/>
+      <w:pPr>
+        <w:ind w:left="5760" w:hanging="360"/>
+      </w:pPr>
+      <w:rPr>
+        <w:rFonts w:ascii="Courier New" w:hAnsi="Courier New" w:cs="Courier New" w:hint="default"/>
+      </w:rPr>
+    </w:lvl>
+    <w:lvl w:ilvl="8" w:tplc="08090005" w:tentative="1">
+      <w:start w:val="1"/>
+      <w:numFmt w:val="bullet"/>
+      <w:lvlText w:val=""/>
+      <w:lvlJc w:val="left"/>
+      <w:pPr>
+        <w:ind w:left="6480" w:hanging="360"/>
+      </w:pPr>
+      <w:rPr>
+        <w:rFonts w:ascii="Wingdings" w:hAnsi="Wingdings" w:hint="default"/>
+      </w:rPr>
+    </w:lvl>
+  </w:abstractNum>
+  <w:abstractNum w:abstractNumId="4" w15:restartNumberingAfterBreak="0">
+    <w:nsid w:val="7D9E629C"/>
+    <w:multiLevelType w:val="hybridMultilevel"/>
+    <w:tmpl w:val="8FB20262"/>
+    <w:lvl w:ilvl="0" w:tplc="08090001">
+      <w:start w:val="1"/>
+      <w:numFmt w:val="bullet"/>
+      <w:lvlText w:val=""/>
+      <w:lvlJc w:val="left"/>
+      <w:pPr>
+        <w:ind w:left="720" w:hanging="360"/>
+      </w:pPr>
+      <w:rPr>
+        <w:rFonts w:ascii="Symbol" w:hAnsi="Symbol" w:hint="default"/>
+      </w:rPr>
+    </w:lvl>
+    <w:lvl w:ilvl="1" w:tplc="08090003" w:tentative="1">
+      <w:start w:val="1"/>
+      <w:numFmt w:val="bullet"/>
+      <w:lvlText w:val="o"/>
+      <w:lvlJc w:val="left"/>
+      <w:pPr>
+        <w:ind w:left="1440" w:hanging="360"/>
+      </w:pPr>
+      <w:rPr>
+        <w:rFonts w:ascii="Courier New" w:hAnsi="Courier New" w:cs="Courier New" w:hint="default"/>
+      </w:rPr>
+    </w:lvl>
+    <w:lvl w:ilvl="2" w:tplc="08090005" w:tentative="1">
+      <w:start w:val="1"/>
+      <w:numFmt w:val="bullet"/>
+      <w:lvlText w:val=""/>
+      <w:lvlJc w:val="left"/>
+      <w:pPr>
+        <w:ind w:left="2160" w:hanging="360"/>
+      </w:pPr>
+      <w:rPr>
+        <w:rFonts w:ascii="Wingdings" w:hAnsi="Wingdings" w:hint="default"/>
+      </w:rPr>
+    </w:lvl>
+    <w:lvl w:ilvl="3" w:tplc="08090001" w:tentative="1">
+      <w:start w:val="1"/>
+      <w:numFmt w:val="bullet"/>
+      <w:lvlText w:val=""/>
+      <w:lvlJc w:val="left"/>
+      <w:pPr>
+        <w:ind w:left="2880" w:hanging="360"/>
+      </w:pPr>
+      <w:rPr>
+        <w:rFonts w:ascii="Symbol" w:hAnsi="Symbol" w:hint="default"/>
+      </w:rPr>
+    </w:lvl>
+    <w:lvl w:ilvl="4" w:tplc="08090003" w:tentative="1">
+      <w:start w:val="1"/>
+      <w:numFmt w:val="bullet"/>
+      <w:lvlText w:val="o"/>
+      <w:lvlJc w:val="left"/>
+      <w:pPr>
+        <w:ind w:left="3600" w:hanging="360"/>
+      </w:pPr>
+      <w:rPr>
+        <w:rFonts w:ascii="Courier New" w:hAnsi="Courier New" w:cs="Courier New" w:hint="default"/>
+      </w:rPr>
+    </w:lvl>
+    <w:lvl w:ilvl="5" w:tplc="08090005" w:tentative="1">
+      <w:start w:val="1"/>
+      <w:numFmt w:val="bullet"/>
+      <w:lvlText w:val=""/>
+      <w:lvlJc w:val="left"/>
+      <w:pPr>
+        <w:ind w:left="4320" w:hanging="360"/>
+      </w:pPr>
+      <w:rPr>
+        <w:rFonts w:ascii="Wingdings" w:hAnsi="Wingdings" w:hint="default"/>
+      </w:rPr>
+    </w:lvl>
+    <w:lvl w:ilvl="6" w:tplc="08090001" w:tentative="1">
+      <w:start w:val="1"/>
+      <w:numFmt w:val="bullet"/>
+      <w:lvlText w:val=""/>
+      <w:lvlJc w:val="left"/>
+      <w:pPr>
+        <w:ind w:left="5040" w:hanging="360"/>
+      </w:pPr>
+      <w:rPr>
+        <w:rFonts w:ascii="Symbol" w:hAnsi="Symbol" w:hint="default"/>
+      </w:rPr>
+    </w:lvl>
+    <w:lvl w:ilvl="7" w:tplc="08090003" w:tentative="1">
+      <w:start w:val="1"/>
+      <w:numFmt w:val="bullet"/>
+      <w:lvlText w:val="o"/>
+      <w:lvlJc w:val="left"/>
+      <w:pPr>
+        <w:ind w:left="5760" w:hanging="360"/>
+      </w:pPr>
+      <w:rPr>
+        <w:rFonts w:ascii="Courier New" w:hAnsi="Courier New" w:cs="Courier New" w:hint="default"/>
+      </w:rPr>
+    </w:lvl>
+    <w:lvl w:ilvl="8" w:tplc="08090005" w:tentative="1">
+      <w:start w:val="1"/>
+      <w:numFmt w:val="bullet"/>
+      <w:lvlText w:val=""/>
+      <w:lvlJc w:val="left"/>
+      <w:pPr>
+        <w:ind w:left="6480" w:hanging="360"/>
+      </w:pPr>
+      <w:rPr>
+        <w:rFonts w:ascii="Wingdings" w:hAnsi="Wingdings" w:hint="default"/>
+      </w:rPr>
+    </w:lvl>
+  </w:abstractNum>
   <w:num w:numId="1" w16cid:durableId="1139109609">
+    <w:abstractNumId w:val="1"/>
+  </w:num>
+  <w:num w:numId="2" w16cid:durableId="1946766107">
     <w:abstractNumId w:val="0"/>
+  </w:num>
+  <w:num w:numId="3" w16cid:durableId="1108348683">
+    <w:abstractNumId w:val="2"/>
+  </w:num>
+  <w:num w:numId="4" w16cid:durableId="1287807491">
+    <w:abstractNumId w:val="3"/>
+  </w:num>
+  <w:num w:numId="5" w16cid:durableId="1353336579">
+    <w:abstractNumId w:val="4"/>
   </w:num>
 </w:numbering>
 </file>
@@ -1598,26 +3024,6 @@
 </file>
 
 <file path=customXml/item1.xml><?xml version="1.0" encoding="utf-8"?>
-<p:properties xmlns:p="http://schemas.microsoft.com/office/2006/metadata/properties" xmlns:xsi="http://www.w3.org/2001/XMLSchema-instance" xmlns:pc="http://schemas.microsoft.com/office/infopath/2007/PartnerControls">
-  <documentManagement>
-    <TaxCatchAll xmlns="ff6c93a2-c4b1-493c-a64e-54e8649e8284" xsi:nil="true"/>
-    <lcf76f155ced4ddcb4097134ff3c332f xmlns="8cb4af8c-38ce-42b4-b5aa-01d3a8f3826f">
-      <Terms xmlns="http://schemas.microsoft.com/office/infopath/2007/PartnerControls"/>
-    </lcf76f155ced4ddcb4097134ff3c332f>
-  </documentManagement>
-</p:properties>
-</file>
-
-<file path=customXml/item2.xml><?xml version="1.0" encoding="utf-8"?>
-<?mso-contentType ?>
-<FormTemplates xmlns="http://schemas.microsoft.com/sharepoint/v3/contenttype/forms">
-  <Display>DocumentLibraryForm</Display>
-  <Edit>DocumentLibraryForm</Edit>
-  <New>DocumentLibraryForm</New>
-</FormTemplates>
-</file>
-
-<file path=customXml/item3.xml><?xml version="1.0" encoding="utf-8"?>
 <ct:contentTypeSchema xmlns:ct="http://schemas.microsoft.com/office/2006/metadata/contentType" xmlns:ma="http://schemas.microsoft.com/office/2006/metadata/properties/metaAttributes" ct:_="" ma:_="" ma:contentTypeName="Document" ma:contentTypeID="0x0101001C1EC249084B8C4FA631BB21532F311C" ma:contentTypeVersion="13" ma:contentTypeDescription="Create a new document." ma:contentTypeScope="" ma:versionID="6740fa94cbe8e30abd8e0b160410ed4c">
   <xsd:schema xmlns:xsd="http://www.w3.org/2001/XMLSchema" xmlns:xs="http://www.w3.org/2001/XMLSchema" xmlns:p="http://schemas.microsoft.com/office/2006/metadata/properties" xmlns:ns2="8cb4af8c-38ce-42b4-b5aa-01d3a8f3826f" xmlns:ns3="ff6c93a2-c4b1-493c-a64e-54e8649e8284" targetNamespace="http://schemas.microsoft.com/office/2006/metadata/properties" ma:root="true" ma:fieldsID="c9c193aa84c1ae10aff55c0fa5578776" ns2:_="" ns3:_="">
     <xsd:import namespace="8cb4af8c-38ce-42b4-b5aa-01d3a8f3826f"/>
@@ -1824,26 +3230,27 @@
 </ct:contentTypeSchema>
 </file>
 
-<file path=customXml/itemProps1.xml><?xml version="1.0" encoding="utf-8"?>
-<ds:datastoreItem xmlns:ds="http://schemas.openxmlformats.org/officeDocument/2006/customXml" ds:itemID="{AC258944-11D1-4A4A-87F2-0D931DB13829}">
-  <ds:schemaRefs>
-    <ds:schemaRef ds:uri="http://schemas.microsoft.com/office/2006/metadata/properties"/>
-    <ds:schemaRef ds:uri="http://schemas.microsoft.com/office/infopath/2007/PartnerControls"/>
-    <ds:schemaRef ds:uri="ff6c93a2-c4b1-493c-a64e-54e8649e8284"/>
-    <ds:schemaRef ds:uri="8cb4af8c-38ce-42b4-b5aa-01d3a8f3826f"/>
-  </ds:schemaRefs>
-</ds:datastoreItem>
+<file path=customXml/item2.xml><?xml version="1.0" encoding="utf-8"?>
+<?mso-contentType ?>
+<FormTemplates xmlns="http://schemas.microsoft.com/sharepoint/v3/contenttype/forms">
+  <Display>DocumentLibraryForm</Display>
+  <Edit>DocumentLibraryForm</Edit>
+  <New>DocumentLibraryForm</New>
+</FormTemplates>
 </file>
 
-<file path=customXml/itemProps2.xml><?xml version="1.0" encoding="utf-8"?>
-<ds:datastoreItem xmlns:ds="http://schemas.openxmlformats.org/officeDocument/2006/customXml" ds:itemID="{303E8979-FE4A-497D-8601-4C740BA7C5B4}">
-  <ds:schemaRefs>
-    <ds:schemaRef ds:uri="http://schemas.microsoft.com/sharepoint/v3/contenttype/forms"/>
-  </ds:schemaRefs>
-</ds:datastoreItem>
+<file path=customXml/item3.xml><?xml version="1.0" encoding="utf-8"?>
+<p:properties xmlns:p="http://schemas.microsoft.com/office/2006/metadata/properties" xmlns:xsi="http://www.w3.org/2001/XMLSchema-instance" xmlns:pc="http://schemas.microsoft.com/office/infopath/2007/PartnerControls">
+  <documentManagement>
+    <TaxCatchAll xmlns="ff6c93a2-c4b1-493c-a64e-54e8649e8284" xsi:nil="true"/>
+    <lcf76f155ced4ddcb4097134ff3c332f xmlns="8cb4af8c-38ce-42b4-b5aa-01d3a8f3826f">
+      <Terms xmlns="http://schemas.microsoft.com/office/infopath/2007/PartnerControls"/>
+    </lcf76f155ced4ddcb4097134ff3c332f>
+  </documentManagement>
+</p:properties>
 </file>
 
-<file path=customXml/itemProps3.xml><?xml version="1.0" encoding="utf-8"?>
+<file path=customXml/itemProps1.xml><?xml version="1.0" encoding="utf-8"?>
 <ds:datastoreItem xmlns:ds="http://schemas.openxmlformats.org/officeDocument/2006/customXml" ds:itemID="{456650BB-2F56-485F-8745-E9AE4B8A49B9}">
   <ds:schemaRefs>
     <ds:schemaRef ds:uri="http://schemas.microsoft.com/office/2006/metadata/contentType"/>
@@ -1860,4 +3267,23 @@
     <ds:schemaRef ds:uri="http://schemas.microsoft.com/internal/obd"/>
   </ds:schemaRefs>
 </ds:datastoreItem>
+</file>
+
+<file path=customXml/itemProps2.xml><?xml version="1.0" encoding="utf-8"?>
+<ds:datastoreItem xmlns:ds="http://schemas.openxmlformats.org/officeDocument/2006/customXml" ds:itemID="{303E8979-FE4A-497D-8601-4C740BA7C5B4}">
+  <ds:schemaRefs>
+    <ds:schemaRef ds:uri="http://schemas.microsoft.com/sharepoint/v3/contenttype/forms"/>
+  </ds:schemaRefs>
+</ds:datastoreItem>
+</file>
+
+<file path=customXml/itemProps3.xml><?xml version="1.0" encoding="utf-8"?>
+<ds:datastoreItem xmlns:ds="http://schemas.openxmlformats.org/officeDocument/2006/customXml" ds:itemID="{AC258944-11D1-4A4A-87F2-0D931DB13829}">
+  <ds:schemaRefs>
+    <ds:schemaRef ds:uri="http://schemas.microsoft.com/office/2006/metadata/properties"/>
+    <ds:schemaRef ds:uri="http://schemas.microsoft.com/office/infopath/2007/PartnerControls"/>
+    <ds:schemaRef ds:uri="ff6c93a2-c4b1-493c-a64e-54e8649e8284"/>
+    <ds:schemaRef ds:uri="8cb4af8c-38ce-42b4-b5aa-01d3a8f3826f"/>
+  </ds:schemaRefs>
+</ds:datastoreItem>
 </file>
</xml_diff>